<commit_message>
User exam update; button to center; backend exam user put, and show
</commit_message>
<xml_diff>
--- a/documentation/FelhasznaloiKezikonyv.docx
+++ b/documentation/FelhasznaloiKezikonyv.docx
@@ -764,6 +764,31 @@
     </w:p>
     <w:p>
       <w:pPr>
+        <w:rPr>
+          <w:rFonts w:ascii="Times New Roman" w:eastAsia="Times New Roman" w:hAnsi="Times New Roman" w:cs="Times New Roman"/>
+          <w:b/>
+          <w:bCs/>
+          <w:kern w:val="0"/>
+          <w:sz w:val="36"/>
+          <w:szCs w:val="36"/>
+          <w:lang w:eastAsia="hu-HU"/>
+        </w:rPr>
+      </w:pPr>
+      <w:r>
+        <w:rPr>
+          <w:rFonts w:ascii="Times New Roman" w:eastAsia="Times New Roman" w:hAnsi="Times New Roman" w:cs="Times New Roman"/>
+          <w:b/>
+          <w:bCs/>
+          <w:kern w:val="0"/>
+          <w:sz w:val="36"/>
+          <w:szCs w:val="36"/>
+          <w:lang w:eastAsia="hu-HU"/>
+        </w:rPr>
+        <w:br w:type="page"/>
+      </w:r>
+    </w:p>
+    <w:p>
+      <w:pPr>
         <w:spacing w:before="100" w:beforeAutospacing="1" w:after="100" w:afterAutospacing="1" w:line="240" w:lineRule="auto"/>
         <w:outlineLvl w:val="1"/>
         <w:rPr>
@@ -786,6 +811,7 @@
           <w:szCs w:val="36"/>
           <w:lang w:eastAsia="hu-HU"/>
         </w:rPr>
+        <w:lastRenderedPageBreak/>
         <w:t>4</w:t>
       </w:r>
       <w:r>
@@ -820,7 +846,6 @@
           <w:szCs w:val="24"/>
           <w:lang w:eastAsia="hu-HU"/>
         </w:rPr>
-        <w:lastRenderedPageBreak/>
         <w:t xml:space="preserve">Az </w:t>
       </w:r>
       <w:r>
@@ -1314,14 +1339,195 @@
           <w:szCs w:val="24"/>
           <w:lang w:eastAsia="hu-HU"/>
         </w:rPr>
-        <w:t>Az "Autók szerszámai" résznél az arra jogosultak követhetik a felszerelések állapotát:</w:t>
+        <w:t xml:space="preserve">Az </w:t>
+      </w:r>
+      <w:r>
+        <w:rPr>
+          <w:rFonts w:ascii="Times New Roman" w:eastAsia="Times New Roman" w:hAnsi="Times New Roman" w:cs="Times New Roman"/>
+          <w:b/>
+          <w:bCs/>
+          <w:kern w:val="0"/>
+          <w:sz w:val="24"/>
+          <w:szCs w:val="24"/>
+          <w:lang w:eastAsia="hu-HU"/>
+        </w:rPr>
+        <w:t>"Autók szerszámai"</w:t>
+      </w:r>
+      <w:r>
+        <w:rPr>
+          <w:rFonts w:ascii="Times New Roman" w:eastAsia="Times New Roman" w:hAnsi="Times New Roman" w:cs="Times New Roman"/>
+          <w:kern w:val="0"/>
+          <w:sz w:val="24"/>
+          <w:szCs w:val="24"/>
+          <w:lang w:eastAsia="hu-HU"/>
+        </w:rPr>
+        <w:t xml:space="preserve"> menüpontban az állománytagok naprakészen követhetik a gépjárműveken elhelyezett technikai felszerelések állapotát és hollétét.</w:t>
       </w:r>
     </w:p>
     <w:p>
       <w:pPr>
+        <w:spacing w:before="100" w:beforeAutospacing="1" w:after="100" w:afterAutospacing="1" w:line="240" w:lineRule="auto"/>
+        <w:outlineLvl w:val="2"/>
+        <w:rPr>
+          <w:rFonts w:ascii="Times New Roman" w:eastAsia="Times New Roman" w:hAnsi="Times New Roman" w:cs="Times New Roman"/>
+          <w:b/>
+          <w:bCs/>
+          <w:kern w:val="0"/>
+          <w:sz w:val="27"/>
+          <w:szCs w:val="27"/>
+          <w:lang w:eastAsia="hu-HU"/>
+        </w:rPr>
+      </w:pPr>
+      <w:r>
+        <w:rPr>
+          <w:rFonts w:ascii="Times New Roman" w:eastAsia="Times New Roman" w:hAnsi="Times New Roman" w:cs="Times New Roman"/>
+          <w:b/>
+          <w:bCs/>
+          <w:kern w:val="0"/>
+          <w:sz w:val="27"/>
+          <w:szCs w:val="27"/>
+          <w:lang w:eastAsia="hu-HU"/>
+        </w:rPr>
+        <w:t>5</w:t>
+      </w:r>
+      <w:r>
+        <w:rPr>
+          <w:rFonts w:ascii="Times New Roman" w:eastAsia="Times New Roman" w:hAnsi="Times New Roman" w:cs="Times New Roman"/>
+          <w:b/>
+          <w:bCs/>
+          <w:kern w:val="0"/>
+          <w:sz w:val="27"/>
+          <w:szCs w:val="27"/>
+          <w:lang w:eastAsia="hu-HU"/>
+        </w:rPr>
+        <w:t>.1. Az eszközök listája</w:t>
+      </w:r>
+    </w:p>
+    <w:p>
+      <w:pPr>
+        <w:spacing w:before="100" w:beforeAutospacing="1" w:after="100" w:afterAutospacing="1" w:line="240" w:lineRule="auto"/>
+        <w:rPr>
+          <w:rFonts w:ascii="Times New Roman" w:eastAsia="Times New Roman" w:hAnsi="Times New Roman" w:cs="Times New Roman"/>
+          <w:kern w:val="0"/>
+          <w:sz w:val="24"/>
+          <w:szCs w:val="24"/>
+          <w:lang w:eastAsia="hu-HU"/>
+        </w:rPr>
+      </w:pPr>
+      <w:r>
+        <w:rPr>
+          <w:rFonts w:ascii="Times New Roman" w:eastAsia="Times New Roman" w:hAnsi="Times New Roman" w:cs="Times New Roman"/>
+          <w:kern w:val="0"/>
+          <w:sz w:val="24"/>
+          <w:szCs w:val="24"/>
+          <w:lang w:eastAsia="hu-HU"/>
+        </w:rPr>
+        <w:t xml:space="preserve">Egy adott gépjármű kiválasztása után (pl. </w:t>
+      </w:r>
+      <w:proofErr w:type="spellStart"/>
+      <w:r>
+        <w:rPr>
+          <w:rFonts w:ascii="Times New Roman" w:eastAsia="Times New Roman" w:hAnsi="Times New Roman" w:cs="Times New Roman"/>
+          <w:i/>
+          <w:iCs/>
+          <w:kern w:val="0"/>
+          <w:sz w:val="24"/>
+          <w:szCs w:val="24"/>
+          <w:lang w:eastAsia="hu-HU"/>
+        </w:rPr>
+        <w:t>Fire</w:t>
+      </w:r>
+      <w:proofErr w:type="spellEnd"/>
+      <w:r>
+        <w:rPr>
+          <w:rFonts w:ascii="Times New Roman" w:eastAsia="Times New Roman" w:hAnsi="Times New Roman" w:cs="Times New Roman"/>
+          <w:i/>
+          <w:iCs/>
+          <w:kern w:val="0"/>
+          <w:sz w:val="24"/>
+          <w:szCs w:val="24"/>
+          <w:lang w:eastAsia="hu-HU"/>
+        </w:rPr>
+        <w:t xml:space="preserve"> </w:t>
+      </w:r>
+      <w:proofErr w:type="spellStart"/>
+      <w:r>
+        <w:rPr>
+          <w:rFonts w:ascii="Times New Roman" w:eastAsia="Times New Roman" w:hAnsi="Times New Roman" w:cs="Times New Roman"/>
+          <w:i/>
+          <w:iCs/>
+          <w:kern w:val="0"/>
+          <w:sz w:val="24"/>
+          <w:szCs w:val="24"/>
+          <w:lang w:eastAsia="hu-HU"/>
+        </w:rPr>
+        <w:t>Truck</w:t>
+      </w:r>
+      <w:proofErr w:type="spellEnd"/>
+      <w:r>
+        <w:rPr>
+          <w:rFonts w:ascii="Times New Roman" w:eastAsia="Times New Roman" w:hAnsi="Times New Roman" w:cs="Times New Roman"/>
+          <w:i/>
+          <w:iCs/>
+          <w:kern w:val="0"/>
+          <w:sz w:val="24"/>
+          <w:szCs w:val="24"/>
+          <w:lang w:eastAsia="hu-HU"/>
+        </w:rPr>
+        <w:t xml:space="preserve"> </w:t>
+      </w:r>
+      <w:proofErr w:type="spellStart"/>
+      <w:r>
+        <w:rPr>
+          <w:rFonts w:ascii="Times New Roman" w:eastAsia="Times New Roman" w:hAnsi="Times New Roman" w:cs="Times New Roman"/>
+          <w:i/>
+          <w:iCs/>
+          <w:kern w:val="0"/>
+          <w:sz w:val="24"/>
+          <w:szCs w:val="24"/>
+          <w:lang w:eastAsia="hu-HU"/>
+        </w:rPr>
+        <w:t>Alpha</w:t>
+      </w:r>
+      <w:proofErr w:type="spellEnd"/>
+      <w:r>
+        <w:rPr>
+          <w:rFonts w:ascii="Times New Roman" w:eastAsia="Times New Roman" w:hAnsi="Times New Roman" w:cs="Times New Roman"/>
+          <w:kern w:val="0"/>
+          <w:sz w:val="24"/>
+          <w:szCs w:val="24"/>
+          <w:lang w:eastAsia="hu-HU"/>
+        </w:rPr>
+        <w:t xml:space="preserve">) megjelenik a </w:t>
+      </w:r>
+      <w:proofErr w:type="spellStart"/>
+      <w:r>
+        <w:rPr>
+          <w:rFonts w:ascii="Times New Roman" w:eastAsia="Times New Roman" w:hAnsi="Times New Roman" w:cs="Times New Roman"/>
+          <w:kern w:val="0"/>
+          <w:sz w:val="24"/>
+          <w:szCs w:val="24"/>
+          <w:lang w:eastAsia="hu-HU"/>
+        </w:rPr>
+        <w:t>járműhöz</w:t>
+      </w:r>
+      <w:proofErr w:type="spellEnd"/>
+      <w:r>
+        <w:rPr>
+          <w:rFonts w:ascii="Times New Roman" w:eastAsia="Times New Roman" w:hAnsi="Times New Roman" w:cs="Times New Roman"/>
+          <w:kern w:val="0"/>
+          <w:sz w:val="24"/>
+          <w:szCs w:val="24"/>
+          <w:lang w:eastAsia="hu-HU"/>
+        </w:rPr>
+        <w:t xml:space="preserve"> rendelt összes szerszám listája.</w:t>
+      </w:r>
+    </w:p>
+    <w:p>
+      <w:pPr>
         <w:numPr>
           <w:ilvl w:val="0"/>
-          <w:numId w:val="25"/>
+          <w:numId w:val="26"/>
         </w:numPr>
         <w:spacing w:before="100" w:beforeAutospacing="1" w:after="100" w:afterAutospacing="1" w:line="240" w:lineRule="auto"/>
         <w:rPr>
@@ -1335,19 +1541,119 @@
       <w:r>
         <w:rPr>
           <w:rFonts w:ascii="Times New Roman" w:eastAsia="Times New Roman" w:hAnsi="Times New Roman" w:cs="Times New Roman"/>
-          <w:kern w:val="0"/>
-          <w:sz w:val="24"/>
-          <w:szCs w:val="24"/>
-          <w:lang w:eastAsia="hu-HU"/>
-        </w:rPr>
-        <w:t>A rendszer jelzi, ha egy eszköz (pl. láncfűrész, légző) felülvizsgálata esedékes.</w:t>
+          <w:b/>
+          <w:bCs/>
+          <w:kern w:val="0"/>
+          <w:sz w:val="24"/>
+          <w:szCs w:val="24"/>
+          <w:lang w:eastAsia="hu-HU"/>
+        </w:rPr>
+        <w:t>Átlátható adatok</w:t>
+      </w:r>
+      <w:r>
+        <w:rPr>
+          <w:rFonts w:ascii="Times New Roman" w:eastAsia="Times New Roman" w:hAnsi="Times New Roman" w:cs="Times New Roman"/>
+          <w:kern w:val="0"/>
+          <w:sz w:val="24"/>
+          <w:szCs w:val="24"/>
+          <w:lang w:eastAsia="hu-HU"/>
+        </w:rPr>
+        <w:t xml:space="preserve">: A listában látható az eszköz megnevezése (pl. </w:t>
+      </w:r>
+      <w:proofErr w:type="spellStart"/>
+      <w:r>
+        <w:rPr>
+          <w:rFonts w:ascii="Times New Roman" w:eastAsia="Times New Roman" w:hAnsi="Times New Roman" w:cs="Times New Roman"/>
+          <w:kern w:val="0"/>
+          <w:sz w:val="24"/>
+          <w:szCs w:val="24"/>
+          <w:lang w:eastAsia="hu-HU"/>
+        </w:rPr>
+        <w:t>Hydraulic</w:t>
+      </w:r>
+      <w:proofErr w:type="spellEnd"/>
+      <w:r>
+        <w:rPr>
+          <w:rFonts w:ascii="Times New Roman" w:eastAsia="Times New Roman" w:hAnsi="Times New Roman" w:cs="Times New Roman"/>
+          <w:kern w:val="0"/>
+          <w:sz w:val="24"/>
+          <w:szCs w:val="24"/>
+          <w:lang w:eastAsia="hu-HU"/>
+        </w:rPr>
+        <w:t xml:space="preserve"> </w:t>
+      </w:r>
+      <w:proofErr w:type="spellStart"/>
+      <w:r>
+        <w:rPr>
+          <w:rFonts w:ascii="Times New Roman" w:eastAsia="Times New Roman" w:hAnsi="Times New Roman" w:cs="Times New Roman"/>
+          <w:kern w:val="0"/>
+          <w:sz w:val="24"/>
+          <w:szCs w:val="24"/>
+          <w:lang w:eastAsia="hu-HU"/>
+        </w:rPr>
+        <w:t>Cutter</w:t>
+      </w:r>
+      <w:proofErr w:type="spellEnd"/>
+      <w:r>
+        <w:rPr>
+          <w:rFonts w:ascii="Times New Roman" w:eastAsia="Times New Roman" w:hAnsi="Times New Roman" w:cs="Times New Roman"/>
+          <w:kern w:val="0"/>
+          <w:sz w:val="24"/>
+          <w:szCs w:val="24"/>
+          <w:lang w:eastAsia="hu-HU"/>
+        </w:rPr>
+        <w:t xml:space="preserve">), tárolási helye (pl. </w:t>
+      </w:r>
+      <w:proofErr w:type="spellStart"/>
+      <w:r>
+        <w:rPr>
+          <w:rFonts w:ascii="Times New Roman" w:eastAsia="Times New Roman" w:hAnsi="Times New Roman" w:cs="Times New Roman"/>
+          <w:kern w:val="0"/>
+          <w:sz w:val="24"/>
+          <w:szCs w:val="24"/>
+          <w:lang w:eastAsia="hu-HU"/>
+        </w:rPr>
+        <w:t>North</w:t>
+      </w:r>
+      <w:proofErr w:type="spellEnd"/>
+      <w:r>
+        <w:rPr>
+          <w:rFonts w:ascii="Times New Roman" w:eastAsia="Times New Roman" w:hAnsi="Times New Roman" w:cs="Times New Roman"/>
+          <w:kern w:val="0"/>
+          <w:sz w:val="24"/>
+          <w:szCs w:val="24"/>
+          <w:lang w:eastAsia="hu-HU"/>
+        </w:rPr>
+        <w:t xml:space="preserve"> </w:t>
+      </w:r>
+      <w:proofErr w:type="spellStart"/>
+      <w:r>
+        <w:rPr>
+          <w:rFonts w:ascii="Times New Roman" w:eastAsia="Times New Roman" w:hAnsi="Times New Roman" w:cs="Times New Roman"/>
+          <w:kern w:val="0"/>
+          <w:sz w:val="24"/>
+          <w:szCs w:val="24"/>
+          <w:lang w:eastAsia="hu-HU"/>
+        </w:rPr>
+        <w:t>Station</w:t>
+      </w:r>
+      <w:proofErr w:type="spellEnd"/>
+      <w:r>
+        <w:rPr>
+          <w:rFonts w:ascii="Times New Roman" w:eastAsia="Times New Roman" w:hAnsi="Times New Roman" w:cs="Times New Roman"/>
+          <w:kern w:val="0"/>
+          <w:sz w:val="24"/>
+          <w:szCs w:val="24"/>
+          <w:lang w:eastAsia="hu-HU"/>
+        </w:rPr>
+        <w:t>) és a következő esedékes felülvizsgálat dátuma.</w:t>
       </w:r>
     </w:p>
     <w:p>
       <w:pPr>
         <w:numPr>
           <w:ilvl w:val="0"/>
-          <w:numId w:val="25"/>
+          <w:numId w:val="26"/>
         </w:numPr>
         <w:spacing w:before="100" w:beforeAutospacing="1" w:after="100" w:afterAutospacing="1" w:line="240" w:lineRule="auto"/>
         <w:rPr>
@@ -1361,13 +1667,530 @@
       <w:r>
         <w:rPr>
           <w:rFonts w:ascii="Times New Roman" w:eastAsia="Times New Roman" w:hAnsi="Times New Roman" w:cs="Times New Roman"/>
-          <w:kern w:val="0"/>
-          <w:sz w:val="24"/>
-          <w:szCs w:val="24"/>
-          <w:lang w:eastAsia="hu-HU"/>
-        </w:rPr>
-        <w:t>Itt lehet rögzíteni az elvégzett ellenőrzések dátumát és eredményét.</w:t>
-      </w:r>
+          <w:b/>
+          <w:bCs/>
+          <w:kern w:val="0"/>
+          <w:sz w:val="24"/>
+          <w:szCs w:val="24"/>
+          <w:lang w:eastAsia="hu-HU"/>
+        </w:rPr>
+        <w:t>Műveletek</w:t>
+      </w:r>
+      <w:r>
+        <w:rPr>
+          <w:rFonts w:ascii="Times New Roman" w:eastAsia="Times New Roman" w:hAnsi="Times New Roman" w:cs="Times New Roman"/>
+          <w:kern w:val="0"/>
+          <w:sz w:val="24"/>
+          <w:szCs w:val="24"/>
+          <w:lang w:eastAsia="hu-HU"/>
+        </w:rPr>
+        <w:t>: Minden eszköznél három gomb érhető el az adatok kezeléséhez:</w:t>
+      </w:r>
+    </w:p>
+    <w:p>
+      <w:pPr>
+        <w:numPr>
+          <w:ilvl w:val="1"/>
+          <w:numId w:val="26"/>
+        </w:numPr>
+        <w:spacing w:before="100" w:beforeAutospacing="1" w:after="100" w:afterAutospacing="1" w:line="240" w:lineRule="auto"/>
+        <w:rPr>
+          <w:rFonts w:ascii="Times New Roman" w:eastAsia="Times New Roman" w:hAnsi="Times New Roman" w:cs="Times New Roman"/>
+          <w:kern w:val="0"/>
+          <w:sz w:val="24"/>
+          <w:szCs w:val="24"/>
+          <w:lang w:eastAsia="hu-HU"/>
+        </w:rPr>
+      </w:pPr>
+      <w:r>
+        <w:rPr>
+          <w:rFonts w:ascii="Times New Roman" w:eastAsia="Times New Roman" w:hAnsi="Times New Roman" w:cs="Times New Roman"/>
+          <w:b/>
+          <w:bCs/>
+          <w:kern w:val="0"/>
+          <w:sz w:val="24"/>
+          <w:szCs w:val="24"/>
+          <w:lang w:eastAsia="hu-HU"/>
+        </w:rPr>
+        <w:t>Részletek</w:t>
+      </w:r>
+      <w:r>
+        <w:rPr>
+          <w:rFonts w:ascii="Times New Roman" w:eastAsia="Times New Roman" w:hAnsi="Times New Roman" w:cs="Times New Roman"/>
+          <w:kern w:val="0"/>
+          <w:sz w:val="24"/>
+          <w:szCs w:val="24"/>
+          <w:lang w:eastAsia="hu-HU"/>
+        </w:rPr>
+        <w:t>: Megnyitja az eszköz teljes felülvizsgálati történetét.</w:t>
+      </w:r>
+    </w:p>
+    <w:p>
+      <w:pPr>
+        <w:numPr>
+          <w:ilvl w:val="1"/>
+          <w:numId w:val="26"/>
+        </w:numPr>
+        <w:spacing w:before="100" w:beforeAutospacing="1" w:after="100" w:afterAutospacing="1" w:line="240" w:lineRule="auto"/>
+        <w:rPr>
+          <w:rFonts w:ascii="Times New Roman" w:eastAsia="Times New Roman" w:hAnsi="Times New Roman" w:cs="Times New Roman"/>
+          <w:kern w:val="0"/>
+          <w:sz w:val="24"/>
+          <w:szCs w:val="24"/>
+          <w:lang w:eastAsia="hu-HU"/>
+        </w:rPr>
+      </w:pPr>
+      <w:r>
+        <w:rPr>
+          <w:rFonts w:ascii="Times New Roman" w:eastAsia="Times New Roman" w:hAnsi="Times New Roman" w:cs="Times New Roman"/>
+          <w:b/>
+          <w:bCs/>
+          <w:kern w:val="0"/>
+          <w:sz w:val="24"/>
+          <w:szCs w:val="24"/>
+          <w:lang w:eastAsia="hu-HU"/>
+        </w:rPr>
+        <w:t>Módosítás</w:t>
+      </w:r>
+      <w:r>
+        <w:rPr>
+          <w:rFonts w:ascii="Times New Roman" w:eastAsia="Times New Roman" w:hAnsi="Times New Roman" w:cs="Times New Roman"/>
+          <w:kern w:val="0"/>
+          <w:sz w:val="24"/>
+          <w:szCs w:val="24"/>
+          <w:lang w:eastAsia="hu-HU"/>
+        </w:rPr>
+        <w:t>: Lehetővé teszi az eszköz nevének vagy helyének szerkesztését.</w:t>
+      </w:r>
+    </w:p>
+    <w:p>
+      <w:pPr>
+        <w:numPr>
+          <w:ilvl w:val="1"/>
+          <w:numId w:val="26"/>
+        </w:numPr>
+        <w:spacing w:before="100" w:beforeAutospacing="1" w:after="100" w:afterAutospacing="1" w:line="240" w:lineRule="auto"/>
+        <w:rPr>
+          <w:rFonts w:ascii="Times New Roman" w:eastAsia="Times New Roman" w:hAnsi="Times New Roman" w:cs="Times New Roman"/>
+          <w:kern w:val="0"/>
+          <w:sz w:val="24"/>
+          <w:szCs w:val="24"/>
+          <w:lang w:eastAsia="hu-HU"/>
+        </w:rPr>
+      </w:pPr>
+      <w:r>
+        <w:rPr>
+          <w:rFonts w:ascii="Times New Roman" w:eastAsia="Times New Roman" w:hAnsi="Times New Roman" w:cs="Times New Roman"/>
+          <w:b/>
+          <w:bCs/>
+          <w:kern w:val="0"/>
+          <w:sz w:val="24"/>
+          <w:szCs w:val="24"/>
+          <w:lang w:eastAsia="hu-HU"/>
+        </w:rPr>
+        <w:t>Törlés</w:t>
+      </w:r>
+      <w:r>
+        <w:rPr>
+          <w:rFonts w:ascii="Times New Roman" w:eastAsia="Times New Roman" w:hAnsi="Times New Roman" w:cs="Times New Roman"/>
+          <w:kern w:val="0"/>
+          <w:sz w:val="24"/>
+          <w:szCs w:val="24"/>
+          <w:lang w:eastAsia="hu-HU"/>
+        </w:rPr>
+        <w:t>: Az eszköz végleges eltávolítása a jármű málhalistájáról.</w:t>
+      </w:r>
+    </w:p>
+    <w:p>
+      <w:pPr>
+        <w:numPr>
+          <w:ilvl w:val="0"/>
+          <w:numId w:val="26"/>
+        </w:numPr>
+        <w:spacing w:before="100" w:beforeAutospacing="1" w:after="100" w:afterAutospacing="1" w:line="240" w:lineRule="auto"/>
+        <w:rPr>
+          <w:rFonts w:ascii="Times New Roman" w:eastAsia="Times New Roman" w:hAnsi="Times New Roman" w:cs="Times New Roman"/>
+          <w:kern w:val="0"/>
+          <w:sz w:val="24"/>
+          <w:szCs w:val="24"/>
+          <w:lang w:eastAsia="hu-HU"/>
+        </w:rPr>
+      </w:pPr>
+      <w:r>
+        <w:rPr>
+          <w:rFonts w:ascii="Times New Roman" w:eastAsia="Times New Roman" w:hAnsi="Times New Roman" w:cs="Times New Roman"/>
+          <w:b/>
+          <w:bCs/>
+          <w:kern w:val="0"/>
+          <w:sz w:val="24"/>
+          <w:szCs w:val="24"/>
+          <w:lang w:eastAsia="hu-HU"/>
+        </w:rPr>
+        <w:t>Új eszköz</w:t>
+      </w:r>
+      <w:r>
+        <w:rPr>
+          <w:rFonts w:ascii="Times New Roman" w:eastAsia="Times New Roman" w:hAnsi="Times New Roman" w:cs="Times New Roman"/>
+          <w:kern w:val="0"/>
+          <w:sz w:val="24"/>
+          <w:szCs w:val="24"/>
+          <w:lang w:eastAsia="hu-HU"/>
+        </w:rPr>
+        <w:t xml:space="preserve">: Az </w:t>
+      </w:r>
+      <w:r>
+        <w:rPr>
+          <w:rFonts w:ascii="Times New Roman" w:eastAsia="Times New Roman" w:hAnsi="Times New Roman" w:cs="Times New Roman"/>
+          <w:b/>
+          <w:bCs/>
+          <w:kern w:val="0"/>
+          <w:sz w:val="24"/>
+          <w:szCs w:val="24"/>
+          <w:lang w:eastAsia="hu-HU"/>
+        </w:rPr>
+        <w:t>"Új eszköz hozzáadása"</w:t>
+      </w:r>
+      <w:r>
+        <w:rPr>
+          <w:rFonts w:ascii="Times New Roman" w:eastAsia="Times New Roman" w:hAnsi="Times New Roman" w:cs="Times New Roman"/>
+          <w:kern w:val="0"/>
+          <w:sz w:val="24"/>
+          <w:szCs w:val="24"/>
+          <w:lang w:eastAsia="hu-HU"/>
+        </w:rPr>
+        <w:t xml:space="preserve"> gombbal bővíthető a jármű felszerelése.</w:t>
+      </w:r>
+    </w:p>
+    <w:p>
+      <w:pPr>
+        <w:spacing w:before="100" w:beforeAutospacing="1" w:after="100" w:afterAutospacing="1" w:line="240" w:lineRule="auto"/>
+        <w:outlineLvl w:val="2"/>
+        <w:rPr>
+          <w:rFonts w:ascii="Times New Roman" w:eastAsia="Times New Roman" w:hAnsi="Times New Roman" w:cs="Times New Roman"/>
+          <w:b/>
+          <w:bCs/>
+          <w:kern w:val="0"/>
+          <w:sz w:val="27"/>
+          <w:szCs w:val="27"/>
+          <w:lang w:eastAsia="hu-HU"/>
+        </w:rPr>
+      </w:pPr>
+      <w:r>
+        <w:rPr>
+          <w:rFonts w:ascii="Times New Roman" w:eastAsia="Times New Roman" w:hAnsi="Times New Roman" w:cs="Times New Roman"/>
+          <w:b/>
+          <w:bCs/>
+          <w:kern w:val="0"/>
+          <w:sz w:val="27"/>
+          <w:szCs w:val="27"/>
+          <w:lang w:eastAsia="hu-HU"/>
+        </w:rPr>
+        <w:t>5</w:t>
+      </w:r>
+      <w:r>
+        <w:rPr>
+          <w:rFonts w:ascii="Times New Roman" w:eastAsia="Times New Roman" w:hAnsi="Times New Roman" w:cs="Times New Roman"/>
+          <w:b/>
+          <w:bCs/>
+          <w:kern w:val="0"/>
+          <w:sz w:val="27"/>
+          <w:szCs w:val="27"/>
+          <w:lang w:eastAsia="hu-HU"/>
+        </w:rPr>
+        <w:t>.2. Felülvizsgálati részletek és rögzítés</w:t>
+      </w:r>
+    </w:p>
+    <w:p>
+      <w:pPr>
+        <w:spacing w:before="100" w:beforeAutospacing="1" w:after="100" w:afterAutospacing="1" w:line="240" w:lineRule="auto"/>
+        <w:rPr>
+          <w:rFonts w:ascii="Times New Roman" w:eastAsia="Times New Roman" w:hAnsi="Times New Roman" w:cs="Times New Roman"/>
+          <w:kern w:val="0"/>
+          <w:sz w:val="24"/>
+          <w:szCs w:val="24"/>
+          <w:lang w:eastAsia="hu-HU"/>
+        </w:rPr>
+      </w:pPr>
+      <w:r>
+        <w:rPr>
+          <w:rFonts w:ascii="Times New Roman" w:eastAsia="Times New Roman" w:hAnsi="Times New Roman" w:cs="Times New Roman"/>
+          <w:kern w:val="0"/>
+          <w:sz w:val="24"/>
+          <w:szCs w:val="24"/>
+          <w:lang w:eastAsia="hu-HU"/>
+        </w:rPr>
+        <w:t xml:space="preserve">A </w:t>
+      </w:r>
+      <w:r>
+        <w:rPr>
+          <w:rFonts w:ascii="Times New Roman" w:eastAsia="Times New Roman" w:hAnsi="Times New Roman" w:cs="Times New Roman"/>
+          <w:b/>
+          <w:bCs/>
+          <w:kern w:val="0"/>
+          <w:sz w:val="24"/>
+          <w:szCs w:val="24"/>
+          <w:lang w:eastAsia="hu-HU"/>
+        </w:rPr>
+        <w:t>"Részletek"</w:t>
+      </w:r>
+      <w:r>
+        <w:rPr>
+          <w:rFonts w:ascii="Times New Roman" w:eastAsia="Times New Roman" w:hAnsi="Times New Roman" w:cs="Times New Roman"/>
+          <w:kern w:val="0"/>
+          <w:sz w:val="24"/>
+          <w:szCs w:val="24"/>
+          <w:lang w:eastAsia="hu-HU"/>
+        </w:rPr>
+        <w:t xml:space="preserve"> gombra kattintva az adott szerszám (pl. </w:t>
+      </w:r>
+      <w:proofErr w:type="spellStart"/>
+      <w:r>
+        <w:rPr>
+          <w:rFonts w:ascii="Times New Roman" w:eastAsia="Times New Roman" w:hAnsi="Times New Roman" w:cs="Times New Roman"/>
+          <w:kern w:val="0"/>
+          <w:sz w:val="24"/>
+          <w:szCs w:val="24"/>
+          <w:lang w:eastAsia="hu-HU"/>
+        </w:rPr>
+        <w:t>Hydraulic</w:t>
+      </w:r>
+      <w:proofErr w:type="spellEnd"/>
+      <w:r>
+        <w:rPr>
+          <w:rFonts w:ascii="Times New Roman" w:eastAsia="Times New Roman" w:hAnsi="Times New Roman" w:cs="Times New Roman"/>
+          <w:kern w:val="0"/>
+          <w:sz w:val="24"/>
+          <w:szCs w:val="24"/>
+          <w:lang w:eastAsia="hu-HU"/>
+        </w:rPr>
+        <w:t xml:space="preserve"> </w:t>
+      </w:r>
+      <w:proofErr w:type="spellStart"/>
+      <w:r>
+        <w:rPr>
+          <w:rFonts w:ascii="Times New Roman" w:eastAsia="Times New Roman" w:hAnsi="Times New Roman" w:cs="Times New Roman"/>
+          <w:kern w:val="0"/>
+          <w:sz w:val="24"/>
+          <w:szCs w:val="24"/>
+          <w:lang w:eastAsia="hu-HU"/>
+        </w:rPr>
+        <w:t>Cutter</w:t>
+      </w:r>
+      <w:proofErr w:type="spellEnd"/>
+      <w:r>
+        <w:rPr>
+          <w:rFonts w:ascii="Times New Roman" w:eastAsia="Times New Roman" w:hAnsi="Times New Roman" w:cs="Times New Roman"/>
+          <w:kern w:val="0"/>
+          <w:sz w:val="24"/>
+          <w:szCs w:val="24"/>
+          <w:lang w:eastAsia="hu-HU"/>
+        </w:rPr>
+        <w:t>) adatlapjára jutunk, ahol a rendszer színekkel segíti a gyors ellenőrzést.</w:t>
+      </w:r>
+    </w:p>
+    <w:p>
+      <w:pPr>
+        <w:numPr>
+          <w:ilvl w:val="0"/>
+          <w:numId w:val="27"/>
+        </w:numPr>
+        <w:spacing w:before="100" w:beforeAutospacing="1" w:after="100" w:afterAutospacing="1" w:line="240" w:lineRule="auto"/>
+        <w:rPr>
+          <w:rFonts w:ascii="Times New Roman" w:eastAsia="Times New Roman" w:hAnsi="Times New Roman" w:cs="Times New Roman"/>
+          <w:kern w:val="0"/>
+          <w:sz w:val="24"/>
+          <w:szCs w:val="24"/>
+          <w:lang w:eastAsia="hu-HU"/>
+        </w:rPr>
+      </w:pPr>
+      <w:r>
+        <w:rPr>
+          <w:rFonts w:ascii="Times New Roman" w:eastAsia="Times New Roman" w:hAnsi="Times New Roman" w:cs="Times New Roman"/>
+          <w:b/>
+          <w:bCs/>
+          <w:kern w:val="0"/>
+          <w:sz w:val="24"/>
+          <w:szCs w:val="24"/>
+          <w:lang w:eastAsia="hu-HU"/>
+        </w:rPr>
+        <w:t>Vizuális állapotjelzés</w:t>
+      </w:r>
+      <w:r>
+        <w:rPr>
+          <w:rFonts w:ascii="Times New Roman" w:eastAsia="Times New Roman" w:hAnsi="Times New Roman" w:cs="Times New Roman"/>
+          <w:kern w:val="0"/>
+          <w:sz w:val="24"/>
+          <w:szCs w:val="24"/>
+          <w:lang w:eastAsia="hu-HU"/>
+        </w:rPr>
+        <w:t>: A korábbi ellenőrzések dátumai színes sávokban jelennek meg, ami jelzi az eszköz akkori állapotát (pl. zöld a megfelelő, piros a hibás vagy lejárt állapotot tükrözi).</w:t>
+      </w:r>
+    </w:p>
+    <w:p>
+      <w:pPr>
+        <w:numPr>
+          <w:ilvl w:val="0"/>
+          <w:numId w:val="27"/>
+        </w:numPr>
+        <w:spacing w:before="100" w:beforeAutospacing="1" w:after="100" w:afterAutospacing="1" w:line="240" w:lineRule="auto"/>
+        <w:rPr>
+          <w:rFonts w:ascii="Times New Roman" w:eastAsia="Times New Roman" w:hAnsi="Times New Roman" w:cs="Times New Roman"/>
+          <w:kern w:val="0"/>
+          <w:sz w:val="24"/>
+          <w:szCs w:val="24"/>
+          <w:lang w:eastAsia="hu-HU"/>
+        </w:rPr>
+      </w:pPr>
+      <w:r>
+        <w:rPr>
+          <w:rFonts w:ascii="Times New Roman" w:eastAsia="Times New Roman" w:hAnsi="Times New Roman" w:cs="Times New Roman"/>
+          <w:b/>
+          <w:bCs/>
+          <w:kern w:val="0"/>
+          <w:sz w:val="24"/>
+          <w:szCs w:val="24"/>
+          <w:lang w:eastAsia="hu-HU"/>
+        </w:rPr>
+        <w:t>Adatkezelés</w:t>
+      </w:r>
+      <w:r>
+        <w:rPr>
+          <w:rFonts w:ascii="Times New Roman" w:eastAsia="Times New Roman" w:hAnsi="Times New Roman" w:cs="Times New Roman"/>
+          <w:kern w:val="0"/>
+          <w:sz w:val="24"/>
+          <w:szCs w:val="24"/>
+          <w:lang w:eastAsia="hu-HU"/>
+        </w:rPr>
+        <w:t>:</w:t>
+      </w:r>
+    </w:p>
+    <w:p>
+      <w:pPr>
+        <w:numPr>
+          <w:ilvl w:val="1"/>
+          <w:numId w:val="27"/>
+        </w:numPr>
+        <w:spacing w:before="100" w:beforeAutospacing="1" w:after="100" w:afterAutospacing="1" w:line="240" w:lineRule="auto"/>
+        <w:rPr>
+          <w:rFonts w:ascii="Times New Roman" w:eastAsia="Times New Roman" w:hAnsi="Times New Roman" w:cs="Times New Roman"/>
+          <w:kern w:val="0"/>
+          <w:sz w:val="24"/>
+          <w:szCs w:val="24"/>
+          <w:lang w:eastAsia="hu-HU"/>
+        </w:rPr>
+      </w:pPr>
+      <w:r>
+        <w:rPr>
+          <w:rFonts w:ascii="Times New Roman" w:eastAsia="Times New Roman" w:hAnsi="Times New Roman" w:cs="Times New Roman"/>
+          <w:b/>
+          <w:bCs/>
+          <w:kern w:val="0"/>
+          <w:sz w:val="24"/>
+          <w:szCs w:val="24"/>
+          <w:lang w:eastAsia="hu-HU"/>
+        </w:rPr>
+        <w:t>Új ellenőrzés dátum</w:t>
+      </w:r>
+      <w:r>
+        <w:rPr>
+          <w:rFonts w:ascii="Times New Roman" w:eastAsia="Times New Roman" w:hAnsi="Times New Roman" w:cs="Times New Roman"/>
+          <w:kern w:val="0"/>
+          <w:sz w:val="24"/>
+          <w:szCs w:val="24"/>
+          <w:lang w:eastAsia="hu-HU"/>
+        </w:rPr>
+        <w:t>: Itt rögzíthető a legfrissebb felülvizsgálat időpontja.</w:t>
+      </w:r>
+    </w:p>
+    <w:p>
+      <w:pPr>
+        <w:numPr>
+          <w:ilvl w:val="1"/>
+          <w:numId w:val="27"/>
+        </w:numPr>
+        <w:spacing w:before="100" w:beforeAutospacing="1" w:after="100" w:afterAutospacing="1" w:line="240" w:lineRule="auto"/>
+        <w:rPr>
+          <w:rFonts w:ascii="Times New Roman" w:eastAsia="Times New Roman" w:hAnsi="Times New Roman" w:cs="Times New Roman"/>
+          <w:kern w:val="0"/>
+          <w:sz w:val="24"/>
+          <w:szCs w:val="24"/>
+          <w:lang w:eastAsia="hu-HU"/>
+        </w:rPr>
+      </w:pPr>
+      <w:r>
+        <w:rPr>
+          <w:rFonts w:ascii="Times New Roman" w:eastAsia="Times New Roman" w:hAnsi="Times New Roman" w:cs="Times New Roman"/>
+          <w:b/>
+          <w:bCs/>
+          <w:kern w:val="0"/>
+          <w:sz w:val="24"/>
+          <w:szCs w:val="24"/>
+          <w:lang w:eastAsia="hu-HU"/>
+        </w:rPr>
+        <w:t>Legutóbbi dátum módosítása</w:t>
+      </w:r>
+      <w:r>
+        <w:rPr>
+          <w:rFonts w:ascii="Times New Roman" w:eastAsia="Times New Roman" w:hAnsi="Times New Roman" w:cs="Times New Roman"/>
+          <w:kern w:val="0"/>
+          <w:sz w:val="24"/>
+          <w:szCs w:val="24"/>
+          <w:lang w:eastAsia="hu-HU"/>
+        </w:rPr>
+        <w:t>: Az utoljára bejegyzett dátum javítására szolgál.</w:t>
+      </w:r>
+    </w:p>
+    <w:p>
+      <w:pPr>
+        <w:numPr>
+          <w:ilvl w:val="1"/>
+          <w:numId w:val="27"/>
+        </w:numPr>
+        <w:spacing w:before="100" w:beforeAutospacing="1" w:after="100" w:afterAutospacing="1" w:line="240" w:lineRule="auto"/>
+        <w:rPr>
+          <w:rFonts w:ascii="Times New Roman" w:eastAsia="Times New Roman" w:hAnsi="Times New Roman" w:cs="Times New Roman"/>
+          <w:kern w:val="0"/>
+          <w:sz w:val="24"/>
+          <w:szCs w:val="24"/>
+          <w:lang w:eastAsia="hu-HU"/>
+        </w:rPr>
+      </w:pPr>
+      <w:r>
+        <w:rPr>
+          <w:rFonts w:ascii="Times New Roman" w:eastAsia="Times New Roman" w:hAnsi="Times New Roman" w:cs="Times New Roman"/>
+          <w:b/>
+          <w:bCs/>
+          <w:kern w:val="0"/>
+          <w:sz w:val="24"/>
+          <w:szCs w:val="24"/>
+          <w:lang w:eastAsia="hu-HU"/>
+        </w:rPr>
+        <w:lastRenderedPageBreak/>
+        <w:t>Legutóbbi törlése</w:t>
+      </w:r>
+      <w:r>
+        <w:rPr>
+          <w:rFonts w:ascii="Times New Roman" w:eastAsia="Times New Roman" w:hAnsi="Times New Roman" w:cs="Times New Roman"/>
+          <w:kern w:val="0"/>
+          <w:sz w:val="24"/>
+          <w:szCs w:val="24"/>
+          <w:lang w:eastAsia="hu-HU"/>
+        </w:rPr>
+        <w:t>: Hibás adatbevitel esetén az utolsó bejegyzés eltávolítható.</w:t>
+      </w:r>
+    </w:p>
+    <w:p>
+      <w:pPr>
+        <w:spacing w:before="100" w:beforeAutospacing="1" w:after="100" w:afterAutospacing="1" w:line="240" w:lineRule="auto"/>
+        <w:outlineLvl w:val="1"/>
+        <w:rPr>
+          <w:rFonts w:ascii="Times New Roman" w:eastAsia="Times New Roman" w:hAnsi="Times New Roman" w:cs="Times New Roman"/>
+          <w:kern w:val="0"/>
+          <w:sz w:val="24"/>
+          <w:szCs w:val="24"/>
+          <w:lang w:eastAsia="hu-HU"/>
+        </w:rPr>
+      </w:pPr>
     </w:p>
     <w:sectPr>
       <w:pgSz w:w="11906" w:h="16838"/>
@@ -1942,6 +2765,155 @@
     </w:lvl>
   </w:abstractNum>
   <w:abstractNum w:abstractNumId="4">
+    <w:nsid w:val="146B0785"/>
+    <w:multiLevelType w:val="multilevel"/>
+    <w:tmpl w:val="383CC0AC"/>
+    <w:lvl w:ilvl="0">
+      <w:start w:val="1"/>
+      <w:numFmt w:val="bullet"/>
+      <w:lvlText w:val=""/>
+      <w:lvlJc w:val="left"/>
+      <w:pPr>
+        <w:tabs>
+          <w:tab w:val="num" w:pos="720"/>
+        </w:tabs>
+        <w:ind w:left="720" w:hanging="360"/>
+      </w:pPr>
+      <w:rPr>
+        <w:rFonts w:ascii="Symbol" w:hAnsi="Symbol" w:hint="default"/>
+        <w:sz w:val="20"/>
+      </w:rPr>
+    </w:lvl>
+    <w:lvl w:ilvl="1">
+      <w:start w:val="1"/>
+      <w:numFmt w:val="bullet"/>
+      <w:lvlText w:val="o"/>
+      <w:lvlJc w:val="left"/>
+      <w:pPr>
+        <w:tabs>
+          <w:tab w:val="num" w:pos="1440"/>
+        </w:tabs>
+        <w:ind w:left="1440" w:hanging="360"/>
+      </w:pPr>
+      <w:rPr>
+        <w:rFonts w:ascii="Courier New" w:hAnsi="Courier New" w:hint="default"/>
+        <w:sz w:val="20"/>
+      </w:rPr>
+    </w:lvl>
+    <w:lvl w:ilvl="2" w:tentative="1">
+      <w:start w:val="1"/>
+      <w:numFmt w:val="bullet"/>
+      <w:lvlText w:val=""/>
+      <w:lvlJc w:val="left"/>
+      <w:pPr>
+        <w:tabs>
+          <w:tab w:val="num" w:pos="2160"/>
+        </w:tabs>
+        <w:ind w:left="2160" w:hanging="360"/>
+      </w:pPr>
+      <w:rPr>
+        <w:rFonts w:ascii="Wingdings" w:hAnsi="Wingdings" w:hint="default"/>
+        <w:sz w:val="20"/>
+      </w:rPr>
+    </w:lvl>
+    <w:lvl w:ilvl="3" w:tentative="1">
+      <w:start w:val="1"/>
+      <w:numFmt w:val="bullet"/>
+      <w:lvlText w:val=""/>
+      <w:lvlJc w:val="left"/>
+      <w:pPr>
+        <w:tabs>
+          <w:tab w:val="num" w:pos="2880"/>
+        </w:tabs>
+        <w:ind w:left="2880" w:hanging="360"/>
+      </w:pPr>
+      <w:rPr>
+        <w:rFonts w:ascii="Wingdings" w:hAnsi="Wingdings" w:hint="default"/>
+        <w:sz w:val="20"/>
+      </w:rPr>
+    </w:lvl>
+    <w:lvl w:ilvl="4" w:tentative="1">
+      <w:start w:val="1"/>
+      <w:numFmt w:val="bullet"/>
+      <w:lvlText w:val=""/>
+      <w:lvlJc w:val="left"/>
+      <w:pPr>
+        <w:tabs>
+          <w:tab w:val="num" w:pos="3600"/>
+        </w:tabs>
+        <w:ind w:left="3600" w:hanging="360"/>
+      </w:pPr>
+      <w:rPr>
+        <w:rFonts w:ascii="Wingdings" w:hAnsi="Wingdings" w:hint="default"/>
+        <w:sz w:val="20"/>
+      </w:rPr>
+    </w:lvl>
+    <w:lvl w:ilvl="5" w:tentative="1">
+      <w:start w:val="1"/>
+      <w:numFmt w:val="bullet"/>
+      <w:lvlText w:val=""/>
+      <w:lvlJc w:val="left"/>
+      <w:pPr>
+        <w:tabs>
+          <w:tab w:val="num" w:pos="4320"/>
+        </w:tabs>
+        <w:ind w:left="4320" w:hanging="360"/>
+      </w:pPr>
+      <w:rPr>
+        <w:rFonts w:ascii="Wingdings" w:hAnsi="Wingdings" w:hint="default"/>
+        <w:sz w:val="20"/>
+      </w:rPr>
+    </w:lvl>
+    <w:lvl w:ilvl="6" w:tentative="1">
+      <w:start w:val="1"/>
+      <w:numFmt w:val="bullet"/>
+      <w:lvlText w:val=""/>
+      <w:lvlJc w:val="left"/>
+      <w:pPr>
+        <w:tabs>
+          <w:tab w:val="num" w:pos="5040"/>
+        </w:tabs>
+        <w:ind w:left="5040" w:hanging="360"/>
+      </w:pPr>
+      <w:rPr>
+        <w:rFonts w:ascii="Wingdings" w:hAnsi="Wingdings" w:hint="default"/>
+        <w:sz w:val="20"/>
+      </w:rPr>
+    </w:lvl>
+    <w:lvl w:ilvl="7" w:tentative="1">
+      <w:start w:val="1"/>
+      <w:numFmt w:val="bullet"/>
+      <w:lvlText w:val=""/>
+      <w:lvlJc w:val="left"/>
+      <w:pPr>
+        <w:tabs>
+          <w:tab w:val="num" w:pos="5760"/>
+        </w:tabs>
+        <w:ind w:left="5760" w:hanging="360"/>
+      </w:pPr>
+      <w:rPr>
+        <w:rFonts w:ascii="Wingdings" w:hAnsi="Wingdings" w:hint="default"/>
+        <w:sz w:val="20"/>
+      </w:rPr>
+    </w:lvl>
+    <w:lvl w:ilvl="8" w:tentative="1">
+      <w:start w:val="1"/>
+      <w:numFmt w:val="bullet"/>
+      <w:lvlText w:val=""/>
+      <w:lvlJc w:val="left"/>
+      <w:pPr>
+        <w:tabs>
+          <w:tab w:val="num" w:pos="6480"/>
+        </w:tabs>
+        <w:ind w:left="6480" w:hanging="360"/>
+      </w:pPr>
+      <w:rPr>
+        <w:rFonts w:ascii="Wingdings" w:hAnsi="Wingdings" w:hint="default"/>
+        <w:sz w:val="20"/>
+      </w:rPr>
+    </w:lvl>
+  </w:abstractNum>
+  <w:abstractNum w:abstractNumId="5">
     <w:nsid w:val="15201DA9"/>
     <w:multiLevelType w:val="multilevel"/>
     <w:tmpl w:val="040E001D"/>
@@ -2039,7 +3011,7 @@
       </w:pPr>
     </w:lvl>
   </w:abstractNum>
-  <w:abstractNum w:abstractNumId="5">
+  <w:abstractNum w:abstractNumId="6">
     <w:nsid w:val="1B041E88"/>
     <w:multiLevelType w:val="multilevel"/>
     <w:tmpl w:val="A9300C80"/>
@@ -2188,7 +3160,7 @@
       </w:rPr>
     </w:lvl>
   </w:abstractNum>
-  <w:abstractNum w:abstractNumId="6">
+  <w:abstractNum w:abstractNumId="7">
     <w:nsid w:val="1C90736F"/>
     <w:multiLevelType w:val="multilevel"/>
     <w:tmpl w:val="A9300C80"/>
@@ -2337,7 +3309,7 @@
       </w:rPr>
     </w:lvl>
   </w:abstractNum>
-  <w:abstractNum w:abstractNumId="7">
+  <w:abstractNum w:abstractNumId="8">
     <w:nsid w:val="21DE7B52"/>
     <w:multiLevelType w:val="multilevel"/>
     <w:tmpl w:val="A9300C80"/>
@@ -2486,7 +3458,7 @@
       </w:rPr>
     </w:lvl>
   </w:abstractNum>
-  <w:abstractNum w:abstractNumId="8">
+  <w:abstractNum w:abstractNumId="9">
     <w:nsid w:val="33DA7793"/>
     <w:multiLevelType w:val="multilevel"/>
     <w:tmpl w:val="A9300C80"/>
@@ -2635,7 +3607,7 @@
       </w:rPr>
     </w:lvl>
   </w:abstractNum>
-  <w:abstractNum w:abstractNumId="9">
+  <w:abstractNum w:abstractNumId="10">
     <w:nsid w:val="37323584"/>
     <w:multiLevelType w:val="multilevel"/>
     <w:tmpl w:val="A9300C80"/>
@@ -2784,7 +3756,7 @@
       </w:rPr>
     </w:lvl>
   </w:abstractNum>
-  <w:abstractNum w:abstractNumId="10">
+  <w:abstractNum w:abstractNumId="11">
     <w:nsid w:val="3C107E23"/>
     <w:multiLevelType w:val="multilevel"/>
     <w:tmpl w:val="A9300C80"/>
@@ -2933,7 +3905,7 @@
       </w:rPr>
     </w:lvl>
   </w:abstractNum>
-  <w:abstractNum w:abstractNumId="11">
+  <w:abstractNum w:abstractNumId="12">
     <w:nsid w:val="3E5923A3"/>
     <w:multiLevelType w:val="multilevel"/>
     <w:tmpl w:val="A9300C80"/>
@@ -3082,7 +4054,7 @@
       </w:rPr>
     </w:lvl>
   </w:abstractNum>
-  <w:abstractNum w:abstractNumId="12">
+  <w:abstractNum w:abstractNumId="13">
     <w:nsid w:val="445F3C71"/>
     <w:multiLevelType w:val="multilevel"/>
     <w:tmpl w:val="E4482868"/>
@@ -3195,7 +4167,7 @@
       </w:pPr>
     </w:lvl>
   </w:abstractNum>
-  <w:abstractNum w:abstractNumId="13">
+  <w:abstractNum w:abstractNumId="14">
     <w:nsid w:val="47AF5766"/>
     <w:multiLevelType w:val="multilevel"/>
     <w:tmpl w:val="A9300C80"/>
@@ -3344,7 +4316,7 @@
       </w:rPr>
     </w:lvl>
   </w:abstractNum>
-  <w:abstractNum w:abstractNumId="14">
+  <w:abstractNum w:abstractNumId="15">
     <w:nsid w:val="4AAD22BF"/>
     <w:multiLevelType w:val="multilevel"/>
     <w:tmpl w:val="A9300C80"/>
@@ -3493,7 +4465,7 @@
       </w:rPr>
     </w:lvl>
   </w:abstractNum>
-  <w:abstractNum w:abstractNumId="15">
+  <w:abstractNum w:abstractNumId="16">
     <w:nsid w:val="50B86D7E"/>
     <w:multiLevelType w:val="multilevel"/>
     <w:tmpl w:val="A9300C80"/>
@@ -3642,7 +4614,7 @@
       </w:rPr>
     </w:lvl>
   </w:abstractNum>
-  <w:abstractNum w:abstractNumId="16">
+  <w:abstractNum w:abstractNumId="17">
     <w:nsid w:val="50CB3E0C"/>
     <w:multiLevelType w:val="multilevel"/>
     <w:tmpl w:val="A9300C80"/>
@@ -3791,7 +4763,7 @@
       </w:rPr>
     </w:lvl>
   </w:abstractNum>
-  <w:abstractNum w:abstractNumId="17">
+  <w:abstractNum w:abstractNumId="18">
     <w:nsid w:val="51905B05"/>
     <w:multiLevelType w:val="multilevel"/>
     <w:tmpl w:val="A9300C80"/>
@@ -3940,7 +4912,7 @@
       </w:rPr>
     </w:lvl>
   </w:abstractNum>
-  <w:abstractNum w:abstractNumId="18">
+  <w:abstractNum w:abstractNumId="19">
     <w:nsid w:val="591F4963"/>
     <w:multiLevelType w:val="multilevel"/>
     <w:tmpl w:val="A9300C80"/>
@@ -4089,7 +5061,7 @@
       </w:rPr>
     </w:lvl>
   </w:abstractNum>
-  <w:abstractNum w:abstractNumId="19">
+  <w:abstractNum w:abstractNumId="20">
     <w:nsid w:val="5C811C2C"/>
     <w:multiLevelType w:val="multilevel"/>
     <w:tmpl w:val="D8A0130E"/>
@@ -4202,7 +5174,7 @@
       </w:pPr>
     </w:lvl>
   </w:abstractNum>
-  <w:abstractNum w:abstractNumId="20">
+  <w:abstractNum w:abstractNumId="21">
     <w:nsid w:val="5D8B5D1E"/>
     <w:multiLevelType w:val="multilevel"/>
     <w:tmpl w:val="A9300C80"/>
@@ -4351,7 +5323,7 @@
       </w:rPr>
     </w:lvl>
   </w:abstractNum>
-  <w:abstractNum w:abstractNumId="21">
+  <w:abstractNum w:abstractNumId="22">
     <w:nsid w:val="64780D68"/>
     <w:multiLevelType w:val="multilevel"/>
     <w:tmpl w:val="A9300C80"/>
@@ -4500,7 +5472,7 @@
       </w:rPr>
     </w:lvl>
   </w:abstractNum>
-  <w:abstractNum w:abstractNumId="22">
+  <w:abstractNum w:abstractNumId="23">
     <w:nsid w:val="683C25CD"/>
     <w:multiLevelType w:val="multilevel"/>
     <w:tmpl w:val="A9300C80"/>
@@ -4649,7 +5621,156 @@
       </w:rPr>
     </w:lvl>
   </w:abstractNum>
-  <w:abstractNum w:abstractNumId="23">
+  <w:abstractNum w:abstractNumId="24">
+    <w:nsid w:val="684B4838"/>
+    <w:multiLevelType w:val="multilevel"/>
+    <w:tmpl w:val="94A61D16"/>
+    <w:lvl w:ilvl="0">
+      <w:start w:val="1"/>
+      <w:numFmt w:val="bullet"/>
+      <w:lvlText w:val=""/>
+      <w:lvlJc w:val="left"/>
+      <w:pPr>
+        <w:tabs>
+          <w:tab w:val="num" w:pos="720"/>
+        </w:tabs>
+        <w:ind w:left="720" w:hanging="360"/>
+      </w:pPr>
+      <w:rPr>
+        <w:rFonts w:ascii="Symbol" w:hAnsi="Symbol" w:hint="default"/>
+        <w:sz w:val="20"/>
+      </w:rPr>
+    </w:lvl>
+    <w:lvl w:ilvl="1">
+      <w:start w:val="1"/>
+      <w:numFmt w:val="bullet"/>
+      <w:lvlText w:val="o"/>
+      <w:lvlJc w:val="left"/>
+      <w:pPr>
+        <w:tabs>
+          <w:tab w:val="num" w:pos="1440"/>
+        </w:tabs>
+        <w:ind w:left="1440" w:hanging="360"/>
+      </w:pPr>
+      <w:rPr>
+        <w:rFonts w:ascii="Courier New" w:hAnsi="Courier New" w:hint="default"/>
+        <w:sz w:val="20"/>
+      </w:rPr>
+    </w:lvl>
+    <w:lvl w:ilvl="2" w:tentative="1">
+      <w:start w:val="1"/>
+      <w:numFmt w:val="bullet"/>
+      <w:lvlText w:val=""/>
+      <w:lvlJc w:val="left"/>
+      <w:pPr>
+        <w:tabs>
+          <w:tab w:val="num" w:pos="2160"/>
+        </w:tabs>
+        <w:ind w:left="2160" w:hanging="360"/>
+      </w:pPr>
+      <w:rPr>
+        <w:rFonts w:ascii="Wingdings" w:hAnsi="Wingdings" w:hint="default"/>
+        <w:sz w:val="20"/>
+      </w:rPr>
+    </w:lvl>
+    <w:lvl w:ilvl="3" w:tentative="1">
+      <w:start w:val="1"/>
+      <w:numFmt w:val="bullet"/>
+      <w:lvlText w:val=""/>
+      <w:lvlJc w:val="left"/>
+      <w:pPr>
+        <w:tabs>
+          <w:tab w:val="num" w:pos="2880"/>
+        </w:tabs>
+        <w:ind w:left="2880" w:hanging="360"/>
+      </w:pPr>
+      <w:rPr>
+        <w:rFonts w:ascii="Wingdings" w:hAnsi="Wingdings" w:hint="default"/>
+        <w:sz w:val="20"/>
+      </w:rPr>
+    </w:lvl>
+    <w:lvl w:ilvl="4" w:tentative="1">
+      <w:start w:val="1"/>
+      <w:numFmt w:val="bullet"/>
+      <w:lvlText w:val=""/>
+      <w:lvlJc w:val="left"/>
+      <w:pPr>
+        <w:tabs>
+          <w:tab w:val="num" w:pos="3600"/>
+        </w:tabs>
+        <w:ind w:left="3600" w:hanging="360"/>
+      </w:pPr>
+      <w:rPr>
+        <w:rFonts w:ascii="Wingdings" w:hAnsi="Wingdings" w:hint="default"/>
+        <w:sz w:val="20"/>
+      </w:rPr>
+    </w:lvl>
+    <w:lvl w:ilvl="5" w:tentative="1">
+      <w:start w:val="1"/>
+      <w:numFmt w:val="bullet"/>
+      <w:lvlText w:val=""/>
+      <w:lvlJc w:val="left"/>
+      <w:pPr>
+        <w:tabs>
+          <w:tab w:val="num" w:pos="4320"/>
+        </w:tabs>
+        <w:ind w:left="4320" w:hanging="360"/>
+      </w:pPr>
+      <w:rPr>
+        <w:rFonts w:ascii="Wingdings" w:hAnsi="Wingdings" w:hint="default"/>
+        <w:sz w:val="20"/>
+      </w:rPr>
+    </w:lvl>
+    <w:lvl w:ilvl="6" w:tentative="1">
+      <w:start w:val="1"/>
+      <w:numFmt w:val="bullet"/>
+      <w:lvlText w:val=""/>
+      <w:lvlJc w:val="left"/>
+      <w:pPr>
+        <w:tabs>
+          <w:tab w:val="num" w:pos="5040"/>
+        </w:tabs>
+        <w:ind w:left="5040" w:hanging="360"/>
+      </w:pPr>
+      <w:rPr>
+        <w:rFonts w:ascii="Wingdings" w:hAnsi="Wingdings" w:hint="default"/>
+        <w:sz w:val="20"/>
+      </w:rPr>
+    </w:lvl>
+    <w:lvl w:ilvl="7" w:tentative="1">
+      <w:start w:val="1"/>
+      <w:numFmt w:val="bullet"/>
+      <w:lvlText w:val=""/>
+      <w:lvlJc w:val="left"/>
+      <w:pPr>
+        <w:tabs>
+          <w:tab w:val="num" w:pos="5760"/>
+        </w:tabs>
+        <w:ind w:left="5760" w:hanging="360"/>
+      </w:pPr>
+      <w:rPr>
+        <w:rFonts w:ascii="Wingdings" w:hAnsi="Wingdings" w:hint="default"/>
+        <w:sz w:val="20"/>
+      </w:rPr>
+    </w:lvl>
+    <w:lvl w:ilvl="8" w:tentative="1">
+      <w:start w:val="1"/>
+      <w:numFmt w:val="bullet"/>
+      <w:lvlText w:val=""/>
+      <w:lvlJc w:val="left"/>
+      <w:pPr>
+        <w:tabs>
+          <w:tab w:val="num" w:pos="6480"/>
+        </w:tabs>
+        <w:ind w:left="6480" w:hanging="360"/>
+      </w:pPr>
+      <w:rPr>
+        <w:rFonts w:ascii="Wingdings" w:hAnsi="Wingdings" w:hint="default"/>
+        <w:sz w:val="20"/>
+      </w:rPr>
+    </w:lvl>
+  </w:abstractNum>
+  <w:abstractNum w:abstractNumId="25">
     <w:nsid w:val="6FEE5C75"/>
     <w:multiLevelType w:val="multilevel"/>
     <w:tmpl w:val="A9300C80"/>
@@ -4798,7 +5919,7 @@
       </w:rPr>
     </w:lvl>
   </w:abstractNum>
-  <w:abstractNum w:abstractNumId="24">
+  <w:abstractNum w:abstractNumId="26">
     <w:nsid w:val="719369CB"/>
     <w:multiLevelType w:val="multilevel"/>
     <w:tmpl w:val="A9300C80"/>
@@ -4948,7 +6069,7 @@
     </w:lvl>
   </w:abstractNum>
   <w:num w:numId="1">
-    <w:abstractNumId w:val="4"/>
+    <w:abstractNumId w:val="5"/>
   </w:num>
   <w:num w:numId="2">
     <w:abstractNumId w:val="1"/>
@@ -4957,70 +6078,76 @@
     <w:abstractNumId w:val="0"/>
   </w:num>
   <w:num w:numId="4">
-    <w:abstractNumId w:val="18"/>
+    <w:abstractNumId w:val="19"/>
   </w:num>
   <w:num w:numId="5">
-    <w:abstractNumId w:val="5"/>
+    <w:abstractNumId w:val="6"/>
   </w:num>
   <w:num w:numId="6">
-    <w:abstractNumId w:val="24"/>
+    <w:abstractNumId w:val="26"/>
   </w:num>
   <w:num w:numId="7">
-    <w:abstractNumId w:val="23"/>
+    <w:abstractNumId w:val="25"/>
   </w:num>
   <w:num w:numId="8">
-    <w:abstractNumId w:val="12"/>
+    <w:abstractNumId w:val="13"/>
   </w:num>
   <w:num w:numId="9">
-    <w:abstractNumId w:val="13"/>
+    <w:abstractNumId w:val="14"/>
   </w:num>
   <w:num w:numId="10">
-    <w:abstractNumId w:val="8"/>
+    <w:abstractNumId w:val="9"/>
   </w:num>
   <w:num w:numId="11">
     <w:abstractNumId w:val="2"/>
   </w:num>
   <w:num w:numId="12">
-    <w:abstractNumId w:val="10"/>
+    <w:abstractNumId w:val="11"/>
   </w:num>
   <w:num w:numId="13">
-    <w:abstractNumId w:val="19"/>
+    <w:abstractNumId w:val="20"/>
   </w:num>
   <w:num w:numId="14">
-    <w:abstractNumId w:val="7"/>
+    <w:abstractNumId w:val="8"/>
   </w:num>
   <w:num w:numId="15">
-    <w:abstractNumId w:val="17"/>
+    <w:abstractNumId w:val="18"/>
   </w:num>
   <w:num w:numId="16">
-    <w:abstractNumId w:val="11"/>
+    <w:abstractNumId w:val="12"/>
   </w:num>
   <w:num w:numId="17">
-    <w:abstractNumId w:val="16"/>
+    <w:abstractNumId w:val="17"/>
   </w:num>
   <w:num w:numId="18">
     <w:abstractNumId w:val="3"/>
   </w:num>
   <w:num w:numId="19">
+    <w:abstractNumId w:val="23"/>
+  </w:num>
+  <w:num w:numId="20">
     <w:abstractNumId w:val="22"/>
   </w:num>
-  <w:num w:numId="20">
+  <w:num w:numId="21">
     <w:abstractNumId w:val="21"/>
   </w:num>
-  <w:num w:numId="21">
-    <w:abstractNumId w:val="20"/>
-  </w:num>
   <w:num w:numId="22">
-    <w:abstractNumId w:val="6"/>
+    <w:abstractNumId w:val="7"/>
   </w:num>
   <w:num w:numId="23">
-    <w:abstractNumId w:val="9"/>
+    <w:abstractNumId w:val="10"/>
   </w:num>
   <w:num w:numId="24">
+    <w:abstractNumId w:val="16"/>
+  </w:num>
+  <w:num w:numId="25">
     <w:abstractNumId w:val="15"/>
   </w:num>
-  <w:num w:numId="25">
-    <w:abstractNumId w:val="14"/>
+  <w:num w:numId="26">
+    <w:abstractNumId w:val="24"/>
+  </w:num>
+  <w:num w:numId="27">
+    <w:abstractNumId w:val="4"/>
   </w:num>
 </w:numbering>
 </file>
@@ -5253,6 +6380,7 @@
   <w:style w:type="character" w:default="1" w:styleId="Bekezdsalapbettpusa">
     <w:name w:val="Default Paragraph Font"/>
     <w:uiPriority w:val="1"/>
+    <w:semiHidden/>
     <w:unhideWhenUsed/>
   </w:style>
   <w:style w:type="table" w:default="1" w:styleId="Normltblzat">

</xml_diff>

<commit_message>
Documentation and css corrections
</commit_message>
<xml_diff>
--- a/documentation/FelhasznaloiKezikonyv.docx
+++ b/documentation/FelhasznaloiKezikonyv.docx
@@ -115,7 +115,7 @@
           <w:lang w:eastAsia="hu-HU"/>
         </w:rPr>
         <w:pict>
-          <v:rect id="_x0000_i1025" style="width:0;height:1.5pt" o:hralign="center" o:hrstd="t" o:hr="t" fillcolor="#a0a0a0" stroked="f"/>
+          <v:rect id="_x0000_i1027" style="width:0;height:1.5pt" o:hralign="center" o:hrstd="t" o:hr="t" fillcolor="#a0a0a0" stroked="f"/>
         </w:pict>
       </w:r>
     </w:p>
@@ -276,7 +276,7 @@
           <w:lang w:eastAsia="hu-HU"/>
         </w:rPr>
         <w:pict>
-          <v:rect id="_x0000_i1026" style="width:0;height:1.5pt" o:hralign="center" o:hrstd="t" o:hr="t" fillcolor="#a0a0a0" stroked="f"/>
+          <v:rect id="_x0000_i1028" style="width:0;height:1.5pt" o:hralign="center" o:hrstd="t" o:hr="t" fillcolor="#a0a0a0" stroked="f"/>
         </w:pict>
       </w:r>
     </w:p>
@@ -541,6 +541,187 @@
     </w:p>
     <w:p>
       <w:pPr>
+        <w:spacing w:before="100" w:beforeAutospacing="1" w:after="100" w:afterAutospacing="1" w:line="240" w:lineRule="auto"/>
+        <w:ind w:left="360"/>
+        <w:rPr>
+          <w:rFonts w:ascii="Times New Roman" w:eastAsia="Times New Roman" w:hAnsi="Times New Roman" w:cs="Times New Roman"/>
+          <w:kern w:val="0"/>
+          <w:sz w:val="24"/>
+          <w:szCs w:val="24"/>
+          <w:lang w:eastAsia="hu-HU"/>
+        </w:rPr>
+      </w:pPr>
+      <w:r>
+        <w:rPr>
+          <w:rFonts w:ascii="Times New Roman" w:eastAsia="Times New Roman" w:hAnsi="Times New Roman" w:cs="Times New Roman"/>
+          <w:noProof/>
+          <w:kern w:val="0"/>
+          <w:sz w:val="24"/>
+          <w:szCs w:val="24"/>
+          <w:lang w:eastAsia="hu-HU"/>
+        </w:rPr>
+        <w:drawing>
+          <wp:anchor distT="0" distB="0" distL="114300" distR="114300" simplePos="0" relativeHeight="251661312" behindDoc="0" locked="0" layoutInCell="1" allowOverlap="1">
+            <wp:simplePos x="0" y="0"/>
+            <wp:positionH relativeFrom="column">
+              <wp:posOffset>3767455</wp:posOffset>
+            </wp:positionH>
+            <wp:positionV relativeFrom="paragraph">
+              <wp:posOffset>45720</wp:posOffset>
+            </wp:positionV>
+            <wp:extent cx="1130935" cy="3086100"/>
+            <wp:effectExtent l="19050" t="0" r="0" b="0"/>
+            <wp:wrapNone/>
+            <wp:docPr id="37" name="Kép 37"/>
+            <wp:cNvGraphicFramePr>
+              <a:graphicFrameLocks xmlns:a="http://schemas.openxmlformats.org/drawingml/2006/main" noChangeAspect="1"/>
+            </wp:cNvGraphicFramePr>
+            <a:graphic xmlns:a="http://schemas.openxmlformats.org/drawingml/2006/main">
+              <a:graphicData uri="http://schemas.openxmlformats.org/drawingml/2006/picture">
+                <pic:pic xmlns:pic="http://schemas.openxmlformats.org/drawingml/2006/picture">
+                  <pic:nvPicPr>
+                    <pic:cNvPr id="0" name="Picture 37"/>
+                    <pic:cNvPicPr>
+                      <a:picLocks noChangeAspect="1" noChangeArrowheads="1"/>
+                    </pic:cNvPicPr>
+                  </pic:nvPicPr>
+                  <pic:blipFill>
+                    <a:blip r:embed="rId7" cstate="print"/>
+                    <a:srcRect/>
+                    <a:stretch>
+                      <a:fillRect/>
+                    </a:stretch>
+                  </pic:blipFill>
+                  <pic:spPr bwMode="auto">
+                    <a:xfrm>
+                      <a:off x="0" y="0"/>
+                      <a:ext cx="1130935" cy="3086100"/>
+                    </a:xfrm>
+                    <a:prstGeom prst="rect">
+                      <a:avLst/>
+                    </a:prstGeom>
+                    <a:noFill/>
+                    <a:ln w="9525">
+                      <a:noFill/>
+                      <a:miter lim="800000"/>
+                      <a:headEnd/>
+                      <a:tailEnd/>
+                    </a:ln>
+                  </pic:spPr>
+                </pic:pic>
+              </a:graphicData>
+            </a:graphic>
+          </wp:anchor>
+        </w:drawing>
+      </w:r>
+      <w:r>
+        <w:rPr>
+          <w:rFonts w:ascii="Times New Roman" w:eastAsia="Times New Roman" w:hAnsi="Times New Roman" w:cs="Times New Roman"/>
+          <w:noProof/>
+          <w:kern w:val="0"/>
+          <w:sz w:val="24"/>
+          <w:szCs w:val="24"/>
+          <w:lang w:eastAsia="hu-HU"/>
+        </w:rPr>
+        <w:drawing>
+          <wp:anchor distT="0" distB="0" distL="114300" distR="114300" simplePos="0" relativeHeight="251658240" behindDoc="0" locked="0" layoutInCell="1" allowOverlap="1">
+            <wp:simplePos x="0" y="0"/>
+            <wp:positionH relativeFrom="column">
+              <wp:posOffset>125095</wp:posOffset>
+            </wp:positionH>
+            <wp:positionV relativeFrom="paragraph">
+              <wp:posOffset>198120</wp:posOffset>
+            </wp:positionV>
+            <wp:extent cx="3128010" cy="1897380"/>
+            <wp:effectExtent l="19050" t="0" r="0" b="0"/>
+            <wp:wrapNone/>
+            <wp:docPr id="2" name="Kép 1" descr="Login.PNG"/>
+            <wp:cNvGraphicFramePr>
+              <a:graphicFrameLocks xmlns:a="http://schemas.openxmlformats.org/drawingml/2006/main" noChangeAspect="1"/>
+            </wp:cNvGraphicFramePr>
+            <a:graphic xmlns:a="http://schemas.openxmlformats.org/drawingml/2006/main">
+              <a:graphicData uri="http://schemas.openxmlformats.org/drawingml/2006/picture">
+                <pic:pic xmlns:pic="http://schemas.openxmlformats.org/drawingml/2006/picture">
+                  <pic:nvPicPr>
+                    <pic:cNvPr id="0" name="Login.PNG"/>
+                    <pic:cNvPicPr/>
+                  </pic:nvPicPr>
+                  <pic:blipFill>
+                    <a:blip r:embed="rId8" cstate="print"/>
+                    <a:stretch>
+                      <a:fillRect/>
+                    </a:stretch>
+                  </pic:blipFill>
+                  <pic:spPr>
+                    <a:xfrm>
+                      <a:off x="0" y="0"/>
+                      <a:ext cx="3128010" cy="1897380"/>
+                    </a:xfrm>
+                    <a:prstGeom prst="rect">
+                      <a:avLst/>
+                    </a:prstGeom>
+                  </pic:spPr>
+                </pic:pic>
+              </a:graphicData>
+            </a:graphic>
+          </wp:anchor>
+        </w:drawing>
+      </w:r>
+    </w:p>
+    <w:p>
+      <w:pPr>
+        <w:spacing w:before="100" w:beforeAutospacing="1" w:after="100" w:afterAutospacing="1" w:line="240" w:lineRule="auto"/>
+        <w:ind w:left="360"/>
+        <w:rPr>
+          <w:rFonts w:ascii="Times New Roman" w:eastAsia="Times New Roman" w:hAnsi="Times New Roman" w:cs="Times New Roman"/>
+          <w:kern w:val="0"/>
+          <w:sz w:val="24"/>
+          <w:szCs w:val="24"/>
+          <w:lang w:eastAsia="hu-HU"/>
+        </w:rPr>
+      </w:pPr>
+    </w:p>
+    <w:p>
+      <w:pPr>
+        <w:spacing w:before="100" w:beforeAutospacing="1" w:after="100" w:afterAutospacing="1" w:line="240" w:lineRule="auto"/>
+        <w:ind w:left="360"/>
+        <w:rPr>
+          <w:rFonts w:ascii="Times New Roman" w:eastAsia="Times New Roman" w:hAnsi="Times New Roman" w:cs="Times New Roman"/>
+          <w:kern w:val="0"/>
+          <w:sz w:val="24"/>
+          <w:szCs w:val="24"/>
+          <w:lang w:eastAsia="hu-HU"/>
+        </w:rPr>
+      </w:pPr>
+    </w:p>
+    <w:p>
+      <w:pPr>
+        <w:spacing w:before="100" w:beforeAutospacing="1" w:after="100" w:afterAutospacing="1" w:line="240" w:lineRule="auto"/>
+        <w:ind w:left="360"/>
+        <w:rPr>
+          <w:rFonts w:ascii="Times New Roman" w:eastAsia="Times New Roman" w:hAnsi="Times New Roman" w:cs="Times New Roman"/>
+          <w:kern w:val="0"/>
+          <w:sz w:val="24"/>
+          <w:szCs w:val="24"/>
+          <w:lang w:eastAsia="hu-HU"/>
+        </w:rPr>
+      </w:pPr>
+    </w:p>
+    <w:p>
+      <w:pPr>
+        <w:spacing w:before="100" w:beforeAutospacing="1" w:after="100" w:afterAutospacing="1" w:line="240" w:lineRule="auto"/>
+        <w:ind w:left="360"/>
+        <w:rPr>
+          <w:rFonts w:ascii="Times New Roman" w:eastAsia="Times New Roman" w:hAnsi="Times New Roman" w:cs="Times New Roman"/>
+          <w:kern w:val="0"/>
+          <w:sz w:val="24"/>
+          <w:szCs w:val="24"/>
+          <w:lang w:eastAsia="hu-HU"/>
+        </w:rPr>
+      </w:pPr>
+    </w:p>
+    <w:p>
+      <w:pPr>
         <w:spacing w:after="0" w:line="240" w:lineRule="auto"/>
         <w:rPr>
           <w:rFonts w:ascii="Times New Roman" w:eastAsia="Times New Roman" w:hAnsi="Times New Roman" w:cs="Times New Roman"/>
@@ -550,16 +731,42 @@
           <w:lang w:eastAsia="hu-HU"/>
         </w:rPr>
       </w:pPr>
-      <w:r>
-        <w:rPr>
-          <w:rFonts w:ascii="Times New Roman" w:eastAsia="Times New Roman" w:hAnsi="Times New Roman" w:cs="Times New Roman"/>
-          <w:kern w:val="0"/>
-          <w:sz w:val="24"/>
-          <w:szCs w:val="24"/>
-          <w:lang w:eastAsia="hu-HU"/>
-        </w:rPr>
+    </w:p>
+    <w:p>
+      <w:pPr>
+        <w:rPr>
+          <w:rFonts w:ascii="Times New Roman" w:eastAsia="Times New Roman" w:hAnsi="Times New Roman" w:cs="Times New Roman"/>
+          <w:b/>
+          <w:bCs/>
+          <w:kern w:val="0"/>
+          <w:sz w:val="36"/>
+          <w:szCs w:val="36"/>
+          <w:lang w:eastAsia="hu-HU"/>
+        </w:rPr>
+      </w:pPr>
+      <w:r>
+        <w:rPr>
+          <w:rFonts w:ascii="Times New Roman" w:eastAsia="Times New Roman" w:hAnsi="Times New Roman" w:cs="Times New Roman"/>
+          <w:b/>
+          <w:bCs/>
+          <w:kern w:val="0"/>
+          <w:sz w:val="36"/>
+          <w:szCs w:val="36"/>
+          <w:lang w:eastAsia="hu-HU"/>
+        </w:rPr>
+        <w:br w:type="page"/>
+      </w:r>
+      <w:r>
+        <w:rPr>
+          <w:rFonts w:ascii="Times New Roman" w:eastAsia="Times New Roman" w:hAnsi="Times New Roman" w:cs="Times New Roman"/>
+          <w:kern w:val="0"/>
+          <w:sz w:val="24"/>
+          <w:szCs w:val="24"/>
+          <w:lang w:eastAsia="hu-HU"/>
+        </w:rPr>
+        <w:lastRenderedPageBreak/>
         <w:pict>
-          <v:rect id="_x0000_i1027" style="width:0;height:1.5pt" o:hralign="center" o:hrstd="t" o:hr="t" fillcolor="#a0a0a0" stroked="f"/>
+          <v:rect id="_x0000_i1029" style="width:0;height:1.5pt" o:hralign="center" o:hrstd="t" o:hr="t" fillcolor="#a0a0a0" stroked="f"/>
         </w:pict>
       </w:r>
     </w:p>
@@ -752,18 +959,307 @@
       <w:r>
         <w:rPr>
           <w:rFonts w:ascii="Times New Roman" w:eastAsia="Times New Roman" w:hAnsi="Times New Roman" w:cs="Times New Roman"/>
-          <w:kern w:val="0"/>
-          <w:sz w:val="24"/>
-          <w:szCs w:val="24"/>
-          <w:lang w:eastAsia="hu-HU"/>
-        </w:rPr>
+          <w:noProof/>
+          <w:kern w:val="0"/>
+          <w:sz w:val="24"/>
+          <w:szCs w:val="24"/>
+          <w:lang w:eastAsia="hu-HU"/>
+        </w:rPr>
+        <w:drawing>
+          <wp:anchor distT="0" distB="0" distL="114300" distR="114300" simplePos="0" relativeHeight="251662336" behindDoc="0" locked="0" layoutInCell="1" allowOverlap="1">
+            <wp:simplePos x="0" y="0"/>
+            <wp:positionH relativeFrom="column">
+              <wp:posOffset>140335</wp:posOffset>
+            </wp:positionH>
+            <wp:positionV relativeFrom="paragraph">
+              <wp:posOffset>86995</wp:posOffset>
+            </wp:positionV>
+            <wp:extent cx="3577590" cy="2296638"/>
+            <wp:effectExtent l="19050" t="0" r="3810" b="0"/>
+            <wp:wrapNone/>
+            <wp:docPr id="3" name="Kép 2" descr="Calendar.PNG"/>
+            <wp:cNvGraphicFramePr>
+              <a:graphicFrameLocks xmlns:a="http://schemas.openxmlformats.org/drawingml/2006/main" noChangeAspect="1"/>
+            </wp:cNvGraphicFramePr>
+            <a:graphic xmlns:a="http://schemas.openxmlformats.org/drawingml/2006/main">
+              <a:graphicData uri="http://schemas.openxmlformats.org/drawingml/2006/picture">
+                <pic:pic xmlns:pic="http://schemas.openxmlformats.org/drawingml/2006/picture">
+                  <pic:nvPicPr>
+                    <pic:cNvPr id="0" name="Calendar.PNG"/>
+                    <pic:cNvPicPr/>
+                  </pic:nvPicPr>
+                  <pic:blipFill>
+                    <a:blip r:embed="rId9" cstate="print"/>
+                    <a:stretch>
+                      <a:fillRect/>
+                    </a:stretch>
+                  </pic:blipFill>
+                  <pic:spPr>
+                    <a:xfrm>
+                      <a:off x="0" y="0"/>
+                      <a:ext cx="3577590" cy="2296638"/>
+                    </a:xfrm>
+                    <a:prstGeom prst="rect">
+                      <a:avLst/>
+                    </a:prstGeom>
+                  </pic:spPr>
+                </pic:pic>
+              </a:graphicData>
+            </a:graphic>
+          </wp:anchor>
+        </w:drawing>
+      </w:r>
+    </w:p>
+    <w:p>
+      <w:pPr>
+        <w:spacing w:after="0" w:line="240" w:lineRule="auto"/>
+        <w:rPr>
+          <w:rFonts w:ascii="Times New Roman" w:eastAsia="Times New Roman" w:hAnsi="Times New Roman" w:cs="Times New Roman"/>
+          <w:kern w:val="0"/>
+          <w:sz w:val="24"/>
+          <w:szCs w:val="24"/>
+          <w:lang w:eastAsia="hu-HU"/>
+        </w:rPr>
+      </w:pPr>
+    </w:p>
+    <w:p>
+      <w:pPr>
+        <w:spacing w:after="0" w:line="240" w:lineRule="auto"/>
+        <w:rPr>
+          <w:rFonts w:ascii="Times New Roman" w:eastAsia="Times New Roman" w:hAnsi="Times New Roman" w:cs="Times New Roman"/>
+          <w:kern w:val="0"/>
+          <w:sz w:val="24"/>
+          <w:szCs w:val="24"/>
+          <w:lang w:eastAsia="hu-HU"/>
+        </w:rPr>
+      </w:pPr>
+    </w:p>
+    <w:p>
+      <w:pPr>
+        <w:spacing w:after="0" w:line="240" w:lineRule="auto"/>
+        <w:rPr>
+          <w:rFonts w:ascii="Times New Roman" w:eastAsia="Times New Roman" w:hAnsi="Times New Roman" w:cs="Times New Roman"/>
+          <w:kern w:val="0"/>
+          <w:sz w:val="24"/>
+          <w:szCs w:val="24"/>
+          <w:lang w:eastAsia="hu-HU"/>
+        </w:rPr>
+      </w:pPr>
+    </w:p>
+    <w:p>
+      <w:pPr>
+        <w:spacing w:after="0" w:line="240" w:lineRule="auto"/>
+        <w:rPr>
+          <w:rFonts w:ascii="Times New Roman" w:eastAsia="Times New Roman" w:hAnsi="Times New Roman" w:cs="Times New Roman"/>
+          <w:kern w:val="0"/>
+          <w:sz w:val="24"/>
+          <w:szCs w:val="24"/>
+          <w:lang w:eastAsia="hu-HU"/>
+        </w:rPr>
+      </w:pPr>
+    </w:p>
+    <w:p>
+      <w:pPr>
+        <w:spacing w:after="0" w:line="240" w:lineRule="auto"/>
+        <w:rPr>
+          <w:rFonts w:ascii="Times New Roman" w:eastAsia="Times New Roman" w:hAnsi="Times New Roman" w:cs="Times New Roman"/>
+          <w:kern w:val="0"/>
+          <w:sz w:val="24"/>
+          <w:szCs w:val="24"/>
+          <w:lang w:eastAsia="hu-HU"/>
+        </w:rPr>
+      </w:pPr>
+    </w:p>
+    <w:p>
+      <w:pPr>
+        <w:spacing w:after="0" w:line="240" w:lineRule="auto"/>
+        <w:rPr>
+          <w:rFonts w:ascii="Times New Roman" w:eastAsia="Times New Roman" w:hAnsi="Times New Roman" w:cs="Times New Roman"/>
+          <w:kern w:val="0"/>
+          <w:sz w:val="24"/>
+          <w:szCs w:val="24"/>
+          <w:lang w:eastAsia="hu-HU"/>
+        </w:rPr>
+      </w:pPr>
+    </w:p>
+    <w:p>
+      <w:pPr>
+        <w:spacing w:after="0" w:line="240" w:lineRule="auto"/>
+        <w:rPr>
+          <w:rFonts w:ascii="Times New Roman" w:eastAsia="Times New Roman" w:hAnsi="Times New Roman" w:cs="Times New Roman"/>
+          <w:kern w:val="0"/>
+          <w:sz w:val="24"/>
+          <w:szCs w:val="24"/>
+          <w:lang w:eastAsia="hu-HU"/>
+        </w:rPr>
+      </w:pPr>
+    </w:p>
+    <w:p>
+      <w:pPr>
+        <w:rPr>
+          <w:rFonts w:ascii="Times New Roman" w:eastAsia="Times New Roman" w:hAnsi="Times New Roman" w:cs="Times New Roman"/>
+          <w:kern w:val="0"/>
+          <w:sz w:val="24"/>
+          <w:szCs w:val="24"/>
+          <w:lang w:eastAsia="hu-HU"/>
+        </w:rPr>
+      </w:pPr>
+      <w:r>
+        <w:rPr>
+          <w:rFonts w:ascii="Times New Roman" w:eastAsia="Times New Roman" w:hAnsi="Times New Roman" w:cs="Times New Roman"/>
+          <w:noProof/>
+          <w:kern w:val="0"/>
+          <w:sz w:val="24"/>
+          <w:szCs w:val="24"/>
+          <w:lang w:eastAsia="hu-HU"/>
+        </w:rPr>
+        <w:drawing>
+          <wp:anchor distT="0" distB="0" distL="114300" distR="114300" simplePos="0" relativeHeight="251663360" behindDoc="0" locked="0" layoutInCell="1" allowOverlap="1">
+            <wp:simplePos x="0" y="0"/>
+            <wp:positionH relativeFrom="column">
+              <wp:posOffset>140335</wp:posOffset>
+            </wp:positionH>
+            <wp:positionV relativeFrom="paragraph">
+              <wp:posOffset>2700655</wp:posOffset>
+            </wp:positionV>
+            <wp:extent cx="5044440" cy="2545080"/>
+            <wp:effectExtent l="19050" t="0" r="3810" b="0"/>
+            <wp:wrapNone/>
+            <wp:docPr id="4" name="Kép 3" descr="CarTools.PNG"/>
+            <wp:cNvGraphicFramePr>
+              <a:graphicFrameLocks xmlns:a="http://schemas.openxmlformats.org/drawingml/2006/main" noChangeAspect="1"/>
+            </wp:cNvGraphicFramePr>
+            <a:graphic xmlns:a="http://schemas.openxmlformats.org/drawingml/2006/main">
+              <a:graphicData uri="http://schemas.openxmlformats.org/drawingml/2006/picture">
+                <pic:pic xmlns:pic="http://schemas.openxmlformats.org/drawingml/2006/picture">
+                  <pic:nvPicPr>
+                    <pic:cNvPr id="0" name="CarTools.PNG"/>
+                    <pic:cNvPicPr/>
+                  </pic:nvPicPr>
+                  <pic:blipFill>
+                    <a:blip r:embed="rId10" cstate="print"/>
+                    <a:stretch>
+                      <a:fillRect/>
+                    </a:stretch>
+                  </pic:blipFill>
+                  <pic:spPr>
+                    <a:xfrm>
+                      <a:off x="0" y="0"/>
+                      <a:ext cx="5044440" cy="2545080"/>
+                    </a:xfrm>
+                    <a:prstGeom prst="rect">
+                      <a:avLst/>
+                    </a:prstGeom>
+                  </pic:spPr>
+                </pic:pic>
+              </a:graphicData>
+            </a:graphic>
+          </wp:anchor>
+        </w:drawing>
+      </w:r>
+      <w:r>
+        <w:rPr>
+          <w:rFonts w:ascii="Times New Roman" w:eastAsia="Times New Roman" w:hAnsi="Times New Roman" w:cs="Times New Roman"/>
+          <w:noProof/>
+          <w:kern w:val="0"/>
+          <w:sz w:val="24"/>
+          <w:szCs w:val="24"/>
+          <w:lang w:eastAsia="hu-HU"/>
+        </w:rPr>
+        <w:drawing>
+          <wp:anchor distT="0" distB="0" distL="114300" distR="114300" simplePos="0" relativeHeight="251660288" behindDoc="0" locked="0" layoutInCell="1" allowOverlap="1">
+            <wp:simplePos x="0" y="0"/>
+            <wp:positionH relativeFrom="column">
+              <wp:posOffset>140335</wp:posOffset>
+            </wp:positionH>
+            <wp:positionV relativeFrom="paragraph">
+              <wp:posOffset>1085215</wp:posOffset>
+            </wp:positionV>
+            <wp:extent cx="5756910" cy="1424940"/>
+            <wp:effectExtent l="19050" t="0" r="0" b="0"/>
+            <wp:wrapNone/>
+            <wp:docPr id="33" name="Kép 33"/>
+            <wp:cNvGraphicFramePr>
+              <a:graphicFrameLocks xmlns:a="http://schemas.openxmlformats.org/drawingml/2006/main" noChangeAspect="1"/>
+            </wp:cNvGraphicFramePr>
+            <a:graphic xmlns:a="http://schemas.openxmlformats.org/drawingml/2006/main">
+              <a:graphicData uri="http://schemas.openxmlformats.org/drawingml/2006/picture">
+                <pic:pic xmlns:pic="http://schemas.openxmlformats.org/drawingml/2006/picture">
+                  <pic:nvPicPr>
+                    <pic:cNvPr id="0" name="Picture 33"/>
+                    <pic:cNvPicPr>
+                      <a:picLocks noChangeAspect="1" noChangeArrowheads="1"/>
+                    </pic:cNvPicPr>
+                  </pic:nvPicPr>
+                  <pic:blipFill>
+                    <a:blip r:embed="rId11" cstate="print"/>
+                    <a:srcRect/>
+                    <a:stretch>
+                      <a:fillRect/>
+                    </a:stretch>
+                  </pic:blipFill>
+                  <pic:spPr bwMode="auto">
+                    <a:xfrm>
+                      <a:off x="0" y="0"/>
+                      <a:ext cx="5756910" cy="1424940"/>
+                    </a:xfrm>
+                    <a:prstGeom prst="rect">
+                      <a:avLst/>
+                    </a:prstGeom>
+                    <a:noFill/>
+                    <a:ln w="9525">
+                      <a:noFill/>
+                      <a:miter lim="800000"/>
+                      <a:headEnd/>
+                      <a:tailEnd/>
+                    </a:ln>
+                  </pic:spPr>
+                </pic:pic>
+              </a:graphicData>
+            </a:graphic>
+          </wp:anchor>
+        </w:drawing>
+      </w:r>
+      <w:r>
+        <w:rPr>
+          <w:rFonts w:ascii="Times New Roman" w:eastAsia="Times New Roman" w:hAnsi="Times New Roman" w:cs="Times New Roman"/>
+          <w:kern w:val="0"/>
+          <w:sz w:val="24"/>
+          <w:szCs w:val="24"/>
+          <w:lang w:eastAsia="hu-HU"/>
+        </w:rPr>
+        <w:br w:type="page"/>
+      </w:r>
+    </w:p>
+    <w:p>
+      <w:pPr>
+        <w:spacing w:after="0" w:line="240" w:lineRule="auto"/>
+        <w:rPr>
+          <w:rFonts w:ascii="Times New Roman" w:eastAsia="Times New Roman" w:hAnsi="Times New Roman" w:cs="Times New Roman"/>
+          <w:kern w:val="0"/>
+          <w:sz w:val="24"/>
+          <w:szCs w:val="24"/>
+          <w:lang w:eastAsia="hu-HU"/>
+        </w:rPr>
+      </w:pPr>
+      <w:r>
+        <w:rPr>
+          <w:rFonts w:ascii="Times New Roman" w:eastAsia="Times New Roman" w:hAnsi="Times New Roman" w:cs="Times New Roman"/>
+          <w:kern w:val="0"/>
+          <w:sz w:val="24"/>
+          <w:szCs w:val="24"/>
+          <w:lang w:eastAsia="hu-HU"/>
+        </w:rPr>
+        <w:lastRenderedPageBreak/>
         <w:pict>
-          <v:rect id="_x0000_i1028" style="width:0;height:1.5pt" o:hralign="center" o:hrstd="t" o:hr="t" fillcolor="#a0a0a0" stroked="f"/>
+          <v:rect id="_x0000_i1026" style="width:0;height:1.5pt" o:hralign="center" o:hrstd="t" o:hr="t" fillcolor="#a0a0a0" stroked="f"/>
         </w:pict>
       </w:r>
     </w:p>
     <w:p>
       <w:pPr>
+        <w:spacing w:before="100" w:beforeAutospacing="1" w:after="100" w:afterAutospacing="1" w:line="240" w:lineRule="auto"/>
+        <w:outlineLvl w:val="1"/>
         <w:rPr>
           <w:rFonts w:ascii="Times New Roman" w:eastAsia="Times New Roman" w:hAnsi="Times New Roman" w:cs="Times New Roman"/>
           <w:b/>
@@ -784,34 +1280,6 @@
           <w:szCs w:val="36"/>
           <w:lang w:eastAsia="hu-HU"/>
         </w:rPr>
-        <w:br w:type="page"/>
-      </w:r>
-    </w:p>
-    <w:p>
-      <w:pPr>
-        <w:spacing w:before="100" w:beforeAutospacing="1" w:after="100" w:afterAutospacing="1" w:line="240" w:lineRule="auto"/>
-        <w:outlineLvl w:val="1"/>
-        <w:rPr>
-          <w:rFonts w:ascii="Times New Roman" w:eastAsia="Times New Roman" w:hAnsi="Times New Roman" w:cs="Times New Roman"/>
-          <w:b/>
-          <w:bCs/>
-          <w:kern w:val="0"/>
-          <w:sz w:val="36"/>
-          <w:szCs w:val="36"/>
-          <w:lang w:eastAsia="hu-HU"/>
-        </w:rPr>
-      </w:pPr>
-      <w:r>
-        <w:rPr>
-          <w:rFonts w:ascii="Times New Roman" w:eastAsia="Times New Roman" w:hAnsi="Times New Roman" w:cs="Times New Roman"/>
-          <w:b/>
-          <w:bCs/>
-          <w:kern w:val="0"/>
-          <w:sz w:val="36"/>
-          <w:szCs w:val="36"/>
-          <w:lang w:eastAsia="hu-HU"/>
-        </w:rPr>
-        <w:lastRenderedPageBreak/>
         <w:t>4</w:t>
       </w:r>
       <w:r>
@@ -934,7 +1402,27 @@
           <w:szCs w:val="24"/>
           <w:lang w:eastAsia="hu-HU"/>
         </w:rPr>
-        <w:t xml:space="preserve"> Új képzési típus rögzítése.</w:t>
+        <w:t xml:space="preserve"> Új </w:t>
+      </w:r>
+      <w:r>
+        <w:rPr>
+          <w:rFonts w:ascii="Times New Roman" w:eastAsia="Times New Roman" w:hAnsi="Times New Roman" w:cs="Times New Roman"/>
+          <w:kern w:val="0"/>
+          <w:sz w:val="24"/>
+          <w:szCs w:val="24"/>
+          <w:lang w:eastAsia="hu-HU"/>
+        </w:rPr>
+        <w:t>vizsga</w:t>
+      </w:r>
+      <w:r>
+        <w:rPr>
+          <w:rFonts w:ascii="Times New Roman" w:eastAsia="Times New Roman" w:hAnsi="Times New Roman" w:cs="Times New Roman"/>
+          <w:kern w:val="0"/>
+          <w:sz w:val="24"/>
+          <w:szCs w:val="24"/>
+          <w:lang w:eastAsia="hu-HU"/>
+        </w:rPr>
+        <w:t xml:space="preserve"> rögzítése.</w:t>
       </w:r>
     </w:p>
     <w:p>
@@ -1239,6 +1727,61 @@
           <w:rFonts w:ascii="Times New Roman" w:eastAsia="Times New Roman" w:hAnsi="Times New Roman" w:cs="Times New Roman"/>
           <w:b/>
           <w:bCs/>
+          <w:noProof/>
+          <w:kern w:val="0"/>
+          <w:sz w:val="24"/>
+          <w:szCs w:val="24"/>
+          <w:lang w:eastAsia="hu-HU"/>
+        </w:rPr>
+        <w:drawing>
+          <wp:anchor distT="0" distB="0" distL="114300" distR="114300" simplePos="0" relativeHeight="251664384" behindDoc="0" locked="0" layoutInCell="1" allowOverlap="1">
+            <wp:simplePos x="0" y="0"/>
+            <wp:positionH relativeFrom="column">
+              <wp:posOffset>3175</wp:posOffset>
+            </wp:positionH>
+            <wp:positionV relativeFrom="paragraph">
+              <wp:posOffset>434975</wp:posOffset>
+            </wp:positionV>
+            <wp:extent cx="4168140" cy="2103120"/>
+            <wp:effectExtent l="19050" t="0" r="3810" b="0"/>
+            <wp:wrapNone/>
+            <wp:docPr id="5" name="Kép 4" descr="Registration.PNG"/>
+            <wp:cNvGraphicFramePr>
+              <a:graphicFrameLocks xmlns:a="http://schemas.openxmlformats.org/drawingml/2006/main" noChangeAspect="1"/>
+            </wp:cNvGraphicFramePr>
+            <a:graphic xmlns:a="http://schemas.openxmlformats.org/drawingml/2006/main">
+              <a:graphicData uri="http://schemas.openxmlformats.org/drawingml/2006/picture">
+                <pic:pic xmlns:pic="http://schemas.openxmlformats.org/drawingml/2006/picture">
+                  <pic:nvPicPr>
+                    <pic:cNvPr id="0" name="Registration.PNG"/>
+                    <pic:cNvPicPr/>
+                  </pic:nvPicPr>
+                  <pic:blipFill>
+                    <a:blip r:embed="rId12" cstate="print"/>
+                    <a:stretch>
+                      <a:fillRect/>
+                    </a:stretch>
+                  </pic:blipFill>
+                  <pic:spPr>
+                    <a:xfrm>
+                      <a:off x="0" y="0"/>
+                      <a:ext cx="4168140" cy="2103120"/>
+                    </a:xfrm>
+                    <a:prstGeom prst="rect">
+                      <a:avLst/>
+                    </a:prstGeom>
+                  </pic:spPr>
+                </pic:pic>
+              </a:graphicData>
+            </a:graphic>
+          </wp:anchor>
+        </w:drawing>
+      </w:r>
+      <w:r>
+        <w:rPr>
+          <w:rFonts w:ascii="Times New Roman" w:eastAsia="Times New Roman" w:hAnsi="Times New Roman" w:cs="Times New Roman"/>
+          <w:b/>
+          <w:bCs/>
           <w:kern w:val="0"/>
           <w:sz w:val="24"/>
           <w:szCs w:val="24"/>
@@ -1259,6 +1802,80 @@
     </w:p>
     <w:p>
       <w:pPr>
+        <w:rPr>
+          <w:rFonts w:ascii="Times New Roman" w:eastAsia="Times New Roman" w:hAnsi="Times New Roman" w:cs="Times New Roman"/>
+          <w:kern w:val="0"/>
+          <w:sz w:val="24"/>
+          <w:szCs w:val="24"/>
+          <w:lang w:eastAsia="hu-HU"/>
+        </w:rPr>
+      </w:pPr>
+      <w:r>
+        <w:rPr>
+          <w:rFonts w:ascii="Times New Roman" w:eastAsia="Times New Roman" w:hAnsi="Times New Roman" w:cs="Times New Roman"/>
+          <w:noProof/>
+          <w:kern w:val="0"/>
+          <w:sz w:val="24"/>
+          <w:szCs w:val="24"/>
+          <w:lang w:eastAsia="hu-HU"/>
+        </w:rPr>
+        <w:drawing>
+          <wp:anchor distT="0" distB="0" distL="114300" distR="114300" simplePos="0" relativeHeight="251665408" behindDoc="0" locked="0" layoutInCell="1" allowOverlap="1">
+            <wp:simplePos x="0" y="0"/>
+            <wp:positionH relativeFrom="column">
+              <wp:posOffset>3175</wp:posOffset>
+            </wp:positionH>
+            <wp:positionV relativeFrom="paragraph">
+              <wp:posOffset>2253615</wp:posOffset>
+            </wp:positionV>
+            <wp:extent cx="4168140" cy="2252620"/>
+            <wp:effectExtent l="19050" t="0" r="3810" b="0"/>
+            <wp:wrapNone/>
+            <wp:docPr id="6" name="Kép 5" descr="Users.PNG"/>
+            <wp:cNvGraphicFramePr>
+              <a:graphicFrameLocks xmlns:a="http://schemas.openxmlformats.org/drawingml/2006/main" noChangeAspect="1"/>
+            </wp:cNvGraphicFramePr>
+            <a:graphic xmlns:a="http://schemas.openxmlformats.org/drawingml/2006/main">
+              <a:graphicData uri="http://schemas.openxmlformats.org/drawingml/2006/picture">
+                <pic:pic xmlns:pic="http://schemas.openxmlformats.org/drawingml/2006/picture">
+                  <pic:nvPicPr>
+                    <pic:cNvPr id="0" name="Users.PNG"/>
+                    <pic:cNvPicPr/>
+                  </pic:nvPicPr>
+                  <pic:blipFill>
+                    <a:blip r:embed="rId13" cstate="print"/>
+                    <a:stretch>
+                      <a:fillRect/>
+                    </a:stretch>
+                  </pic:blipFill>
+                  <pic:spPr>
+                    <a:xfrm>
+                      <a:off x="0" y="0"/>
+                      <a:ext cx="4168140" cy="2252620"/>
+                    </a:xfrm>
+                    <a:prstGeom prst="rect">
+                      <a:avLst/>
+                    </a:prstGeom>
+                  </pic:spPr>
+                </pic:pic>
+              </a:graphicData>
+            </a:graphic>
+          </wp:anchor>
+        </w:drawing>
+      </w:r>
+      <w:r>
+        <w:rPr>
+          <w:rFonts w:ascii="Times New Roman" w:eastAsia="Times New Roman" w:hAnsi="Times New Roman" w:cs="Times New Roman"/>
+          <w:kern w:val="0"/>
+          <w:sz w:val="24"/>
+          <w:szCs w:val="24"/>
+          <w:lang w:eastAsia="hu-HU"/>
+        </w:rPr>
+        <w:br w:type="page"/>
+      </w:r>
+    </w:p>
+    <w:p>
+      <w:pPr>
         <w:spacing w:after="0" w:line="240" w:lineRule="auto"/>
         <w:rPr>
           <w:rFonts w:ascii="Times New Roman" w:eastAsia="Times New Roman" w:hAnsi="Times New Roman" w:cs="Times New Roman"/>
@@ -1276,8 +1893,9 @@
           <w:szCs w:val="24"/>
           <w:lang w:eastAsia="hu-HU"/>
         </w:rPr>
+        <w:lastRenderedPageBreak/>
         <w:pict>
-          <v:rect id="_x0000_i1029" style="width:0;height:1.5pt" o:hralign="center" o:hrstd="t" o:hr="t" fillcolor="#a0a0a0" stroked="f"/>
+          <v:rect id="_x0000_i1025" style="width:0;height:1.5pt" o:hralign="center" o:hrstd="t" o:hr="t" fillcolor="#a0a0a0" stroked="f"/>
         </w:pict>
       </w:r>
     </w:p>
@@ -2165,7 +2783,6 @@
           <w:szCs w:val="24"/>
           <w:lang w:eastAsia="hu-HU"/>
         </w:rPr>
-        <w:lastRenderedPageBreak/>
         <w:t>Legutóbbi törlése</w:t>
       </w:r>
       <w:r>
@@ -2191,8 +2808,285 @@
           <w:lang w:eastAsia="hu-HU"/>
         </w:rPr>
       </w:pPr>
+      <w:r>
+        <w:rPr>
+          <w:rFonts w:ascii="Times New Roman" w:eastAsia="Times New Roman" w:hAnsi="Times New Roman" w:cs="Times New Roman"/>
+          <w:noProof/>
+          <w:kern w:val="0"/>
+          <w:sz w:val="24"/>
+          <w:szCs w:val="24"/>
+          <w:lang w:eastAsia="hu-HU"/>
+        </w:rPr>
+        <w:drawing>
+          <wp:inline distT="0" distB="0" distL="0" distR="0">
+            <wp:extent cx="4385219" cy="1722120"/>
+            <wp:effectExtent l="19050" t="0" r="0" b="0"/>
+            <wp:docPr id="44" name="Kép 44"/>
+            <wp:cNvGraphicFramePr>
+              <a:graphicFrameLocks xmlns:a="http://schemas.openxmlformats.org/drawingml/2006/main" noChangeAspect="1"/>
+            </wp:cNvGraphicFramePr>
+            <a:graphic xmlns:a="http://schemas.openxmlformats.org/drawingml/2006/main">
+              <a:graphicData uri="http://schemas.openxmlformats.org/drawingml/2006/picture">
+                <pic:pic xmlns:pic="http://schemas.openxmlformats.org/drawingml/2006/picture">
+                  <pic:nvPicPr>
+                    <pic:cNvPr id="0" name="Picture 44"/>
+                    <pic:cNvPicPr>
+                      <a:picLocks noChangeAspect="1" noChangeArrowheads="1"/>
+                    </pic:cNvPicPr>
+                  </pic:nvPicPr>
+                  <pic:blipFill>
+                    <a:blip r:embed="rId14" cstate="print"/>
+                    <a:srcRect/>
+                    <a:stretch>
+                      <a:fillRect/>
+                    </a:stretch>
+                  </pic:blipFill>
+                  <pic:spPr bwMode="auto">
+                    <a:xfrm>
+                      <a:off x="0" y="0"/>
+                      <a:ext cx="4388121" cy="1723260"/>
+                    </a:xfrm>
+                    <a:prstGeom prst="rect">
+                      <a:avLst/>
+                    </a:prstGeom>
+                    <a:noFill/>
+                    <a:ln w="9525">
+                      <a:noFill/>
+                      <a:miter lim="800000"/>
+                      <a:headEnd/>
+                      <a:tailEnd/>
+                    </a:ln>
+                  </pic:spPr>
+                </pic:pic>
+              </a:graphicData>
+            </a:graphic>
+          </wp:inline>
+        </w:drawing>
+      </w:r>
+    </w:p>
+    <w:p>
+      <w:pPr>
+        <w:spacing w:before="100" w:beforeAutospacing="1" w:after="100" w:afterAutospacing="1" w:line="240" w:lineRule="auto"/>
+        <w:outlineLvl w:val="1"/>
+        <w:rPr>
+          <w:rFonts w:ascii="Times New Roman" w:eastAsia="Times New Roman" w:hAnsi="Times New Roman" w:cs="Times New Roman"/>
+          <w:kern w:val="0"/>
+          <w:sz w:val="24"/>
+          <w:szCs w:val="24"/>
+          <w:lang w:eastAsia="hu-HU"/>
+        </w:rPr>
+      </w:pPr>
+      <w:r>
+        <w:rPr>
+          <w:rFonts w:ascii="Times New Roman" w:eastAsia="Times New Roman" w:hAnsi="Times New Roman" w:cs="Times New Roman"/>
+          <w:kern w:val="0"/>
+          <w:sz w:val="24"/>
+          <w:szCs w:val="24"/>
+          <w:lang w:eastAsia="hu-HU"/>
+        </w:rPr>
+        <w:lastRenderedPageBreak/>
+        <w:drawing>
+          <wp:inline distT="0" distB="0" distL="0" distR="0">
+            <wp:extent cx="4252264" cy="2758440"/>
+            <wp:effectExtent l="19050" t="0" r="0" b="0"/>
+            <wp:docPr id="10" name="Kép 8" descr="ReviewDates.PNG"/>
+            <wp:cNvGraphicFramePr>
+              <a:graphicFrameLocks xmlns:a="http://schemas.openxmlformats.org/drawingml/2006/main" noChangeAspect="1"/>
+            </wp:cNvGraphicFramePr>
+            <a:graphic xmlns:a="http://schemas.openxmlformats.org/drawingml/2006/main">
+              <a:graphicData uri="http://schemas.openxmlformats.org/drawingml/2006/picture">
+                <pic:pic xmlns:pic="http://schemas.openxmlformats.org/drawingml/2006/picture">
+                  <pic:nvPicPr>
+                    <pic:cNvPr id="0" name="ReviewDates.PNG"/>
+                    <pic:cNvPicPr/>
+                  </pic:nvPicPr>
+                  <pic:blipFill>
+                    <a:blip r:embed="rId15" cstate="print"/>
+                    <a:stretch>
+                      <a:fillRect/>
+                    </a:stretch>
+                  </pic:blipFill>
+                  <pic:spPr>
+                    <a:xfrm>
+                      <a:off x="0" y="0"/>
+                      <a:ext cx="4255879" cy="2760785"/>
+                    </a:xfrm>
+                    <a:prstGeom prst="rect">
+                      <a:avLst/>
+                    </a:prstGeom>
+                  </pic:spPr>
+                </pic:pic>
+              </a:graphicData>
+            </a:graphic>
+          </wp:inline>
+        </w:drawing>
+      </w:r>
+    </w:p>
+    <w:p>
+      <w:pPr>
+        <w:spacing w:before="100" w:beforeAutospacing="1" w:after="100" w:afterAutospacing="1" w:line="240" w:lineRule="auto"/>
+        <w:outlineLvl w:val="1"/>
+        <w:rPr>
+          <w:rFonts w:ascii="Times New Roman" w:eastAsia="Times New Roman" w:hAnsi="Times New Roman" w:cs="Times New Roman"/>
+          <w:kern w:val="0"/>
+          <w:sz w:val="24"/>
+          <w:szCs w:val="24"/>
+          <w:lang w:eastAsia="hu-HU"/>
+        </w:rPr>
+      </w:pPr>
+      <w:r>
+        <w:rPr>
+          <w:rFonts w:ascii="Times New Roman" w:eastAsia="Times New Roman" w:hAnsi="Times New Roman" w:cs="Times New Roman"/>
+          <w:noProof/>
+          <w:kern w:val="0"/>
+          <w:sz w:val="24"/>
+          <w:szCs w:val="24"/>
+          <w:lang w:eastAsia="hu-HU"/>
+        </w:rPr>
+        <w:drawing>
+          <wp:inline distT="0" distB="0" distL="0" distR="0">
+            <wp:extent cx="4195263" cy="2743200"/>
+            <wp:effectExtent l="19050" t="0" r="0" b="0"/>
+            <wp:docPr id="8" name="Kép 7" descr="NewDate.PNG"/>
+            <wp:cNvGraphicFramePr>
+              <a:graphicFrameLocks xmlns:a="http://schemas.openxmlformats.org/drawingml/2006/main" noChangeAspect="1"/>
+            </wp:cNvGraphicFramePr>
+            <a:graphic xmlns:a="http://schemas.openxmlformats.org/drawingml/2006/main">
+              <a:graphicData uri="http://schemas.openxmlformats.org/drawingml/2006/picture">
+                <pic:pic xmlns:pic="http://schemas.openxmlformats.org/drawingml/2006/picture">
+                  <pic:nvPicPr>
+                    <pic:cNvPr id="0" name="NewDate.PNG"/>
+                    <pic:cNvPicPr/>
+                  </pic:nvPicPr>
+                  <pic:blipFill>
+                    <a:blip r:embed="rId16" cstate="print"/>
+                    <a:stretch>
+                      <a:fillRect/>
+                    </a:stretch>
+                  </pic:blipFill>
+                  <pic:spPr>
+                    <a:xfrm>
+                      <a:off x="0" y="0"/>
+                      <a:ext cx="4202075" cy="2747654"/>
+                    </a:xfrm>
+                    <a:prstGeom prst="rect">
+                      <a:avLst/>
+                    </a:prstGeom>
+                  </pic:spPr>
+                </pic:pic>
+              </a:graphicData>
+            </a:graphic>
+          </wp:inline>
+        </w:drawing>
+      </w:r>
+    </w:p>
+    <w:p>
+      <w:pPr>
+        <w:spacing w:before="100" w:beforeAutospacing="1" w:after="100" w:afterAutospacing="1" w:line="240" w:lineRule="auto"/>
+        <w:outlineLvl w:val="1"/>
+        <w:rPr>
+          <w:rFonts w:ascii="Times New Roman" w:eastAsia="Times New Roman" w:hAnsi="Times New Roman" w:cs="Times New Roman"/>
+          <w:kern w:val="0"/>
+          <w:sz w:val="24"/>
+          <w:szCs w:val="24"/>
+          <w:lang w:eastAsia="hu-HU"/>
+        </w:rPr>
+      </w:pPr>
+    </w:p>
+    <w:p>
+      <w:pPr>
+        <w:rPr>
+          <w:rFonts w:ascii="Times New Roman" w:eastAsia="Times New Roman" w:hAnsi="Times New Roman" w:cs="Times New Roman"/>
+          <w:sz w:val="24"/>
+          <w:szCs w:val="24"/>
+          <w:lang w:eastAsia="hu-HU"/>
+        </w:rPr>
+      </w:pPr>
+    </w:p>
+    <w:p>
+      <w:pPr>
+        <w:rPr>
+          <w:rFonts w:ascii="Times New Roman" w:eastAsia="Times New Roman" w:hAnsi="Times New Roman" w:cs="Times New Roman"/>
+          <w:sz w:val="24"/>
+          <w:szCs w:val="24"/>
+          <w:lang w:eastAsia="hu-HU"/>
+        </w:rPr>
+      </w:pPr>
+    </w:p>
+    <w:p>
+      <w:pPr>
+        <w:rPr>
+          <w:rFonts w:ascii="Times New Roman" w:eastAsia="Times New Roman" w:hAnsi="Times New Roman" w:cs="Times New Roman"/>
+          <w:sz w:val="24"/>
+          <w:szCs w:val="24"/>
+          <w:lang w:eastAsia="hu-HU"/>
+        </w:rPr>
+      </w:pPr>
+    </w:p>
+    <w:p>
+      <w:pPr>
+        <w:rPr>
+          <w:rFonts w:ascii="Times New Roman" w:eastAsia="Times New Roman" w:hAnsi="Times New Roman" w:cs="Times New Roman"/>
+          <w:sz w:val="24"/>
+          <w:szCs w:val="24"/>
+          <w:lang w:eastAsia="hu-HU"/>
+        </w:rPr>
+      </w:pPr>
+    </w:p>
+    <w:p>
+      <w:pPr>
+        <w:rPr>
+          <w:rFonts w:ascii="Times New Roman" w:eastAsia="Times New Roman" w:hAnsi="Times New Roman" w:cs="Times New Roman"/>
+          <w:sz w:val="24"/>
+          <w:szCs w:val="24"/>
+          <w:lang w:eastAsia="hu-HU"/>
+        </w:rPr>
+      </w:pPr>
+    </w:p>
+    <w:p>
+      <w:pPr>
+        <w:rPr>
+          <w:rFonts w:ascii="Times New Roman" w:eastAsia="Times New Roman" w:hAnsi="Times New Roman" w:cs="Times New Roman"/>
+          <w:sz w:val="24"/>
+          <w:szCs w:val="24"/>
+          <w:lang w:eastAsia="hu-HU"/>
+        </w:rPr>
+      </w:pPr>
+    </w:p>
+    <w:p>
+      <w:pPr>
+        <w:rPr>
+          <w:rFonts w:ascii="Times New Roman" w:eastAsia="Times New Roman" w:hAnsi="Times New Roman" w:cs="Times New Roman"/>
+          <w:sz w:val="24"/>
+          <w:szCs w:val="24"/>
+          <w:lang w:eastAsia="hu-HU"/>
+        </w:rPr>
+      </w:pPr>
+    </w:p>
+    <w:p>
+      <w:pPr>
+        <w:tabs>
+          <w:tab w:val="left" w:pos="7092"/>
+        </w:tabs>
+        <w:rPr>
+          <w:rFonts w:ascii="Times New Roman" w:eastAsia="Times New Roman" w:hAnsi="Times New Roman" w:cs="Times New Roman"/>
+          <w:sz w:val="24"/>
+          <w:szCs w:val="24"/>
+          <w:lang w:eastAsia="hu-HU"/>
+        </w:rPr>
+      </w:pPr>
+      <w:r>
+        <w:rPr>
+          <w:rFonts w:ascii="Times New Roman" w:eastAsia="Times New Roman" w:hAnsi="Times New Roman" w:cs="Times New Roman"/>
+          <w:sz w:val="24"/>
+          <w:szCs w:val="24"/>
+          <w:lang w:eastAsia="hu-HU"/>
+        </w:rPr>
+        <w:tab/>
+      </w:r>
     </w:p>
     <w:sectPr>
+      <w:footerReference w:type="default" r:id="rId17"/>
       <w:pgSz w:w="11906" w:h="16838"/>
       <w:pgMar w:top="1417" w:right="1417" w:bottom="1417" w:left="1417" w:header="708" w:footer="708" w:gutter="0"/>
       <w:cols w:space="708"/>
@@ -2200,6 +3094,91 @@
     </w:sectPr>
   </w:body>
 </w:document>
+</file>
+
+<file path=word/endnotes.xml><?xml version="1.0" encoding="utf-8"?>
+<w:endnotes xmlns:ve="http://schemas.openxmlformats.org/markup-compatibility/2006" xmlns:o="urn:schemas-microsoft-com:office:office" xmlns:r="http://schemas.openxmlformats.org/officeDocument/2006/relationships" xmlns:m="http://schemas.openxmlformats.org/officeDocument/2006/math" xmlns:v="urn:schemas-microsoft-com:vml" xmlns:wp="http://schemas.openxmlformats.org/drawingml/2006/wordprocessingDrawing" xmlns:w10="urn:schemas-microsoft-com:office:word" xmlns:w="http://schemas.openxmlformats.org/wordprocessingml/2006/main" xmlns:wne="http://schemas.microsoft.com/office/word/2006/wordml">
+  <w:endnote w:type="separator" w:id="-1">
+    <w:p>
+      <w:pPr>
+        <w:spacing w:after="0" w:line="240" w:lineRule="auto"/>
+      </w:pPr>
+      <w:r>
+        <w:separator/>
+      </w:r>
+    </w:p>
+  </w:endnote>
+  <w:endnote w:type="continuationSeparator" w:id="0">
+    <w:p>
+      <w:pPr>
+        <w:spacing w:after="0" w:line="240" w:lineRule="auto"/>
+      </w:pPr>
+      <w:r>
+        <w:continuationSeparator/>
+      </w:r>
+    </w:p>
+  </w:endnote>
+</w:endnotes>
+</file>
+
+<file path=word/footer1.xml><?xml version="1.0" encoding="utf-8"?>
+<w:ftr xmlns:ve="http://schemas.openxmlformats.org/markup-compatibility/2006" xmlns:o="urn:schemas-microsoft-com:office:office" xmlns:r="http://schemas.openxmlformats.org/officeDocument/2006/relationships" xmlns:m="http://schemas.openxmlformats.org/officeDocument/2006/math" xmlns:v="urn:schemas-microsoft-com:vml" xmlns:wp="http://schemas.openxmlformats.org/drawingml/2006/wordprocessingDrawing" xmlns:w10="urn:schemas-microsoft-com:office:word" xmlns:w="http://schemas.openxmlformats.org/wordprocessingml/2006/main" xmlns:wne="http://schemas.microsoft.com/office/word/2006/wordml">
+  <w:sdt>
+    <w:sdtPr>
+      <w:id w:val="-1673884872"/>
+      <w:docPartObj>
+        <w:docPartGallery w:val="Page Numbers (Bottom of Page)"/>
+        <w:docPartUnique/>
+      </w:docPartObj>
+    </w:sdtPr>
+    <w:sdtContent>
+      <w:p>
+        <w:pPr>
+          <w:pStyle w:val="llb"/>
+          <w:jc w:val="right"/>
+        </w:pPr>
+        <w:fldSimple w:instr=" PAGE   \* MERGEFORMAT ">
+          <w:r>
+            <w:rPr>
+              <w:noProof/>
+            </w:rPr>
+            <w:t>5</w:t>
+          </w:r>
+        </w:fldSimple>
+      </w:p>
+    </w:sdtContent>
+  </w:sdt>
+  <w:p>
+    <w:pPr>
+      <w:pStyle w:val="llb"/>
+    </w:pPr>
+  </w:p>
+</w:ftr>
+</file>
+
+<file path=word/footnotes.xml><?xml version="1.0" encoding="utf-8"?>
+<w:footnotes xmlns:ve="http://schemas.openxmlformats.org/markup-compatibility/2006" xmlns:o="urn:schemas-microsoft-com:office:office" xmlns:r="http://schemas.openxmlformats.org/officeDocument/2006/relationships" xmlns:m="http://schemas.openxmlformats.org/officeDocument/2006/math" xmlns:v="urn:schemas-microsoft-com:vml" xmlns:wp="http://schemas.openxmlformats.org/drawingml/2006/wordprocessingDrawing" xmlns:w10="urn:schemas-microsoft-com:office:word" xmlns:w="http://schemas.openxmlformats.org/wordprocessingml/2006/main" xmlns:wne="http://schemas.microsoft.com/office/word/2006/wordml">
+  <w:footnote w:type="separator" w:id="-1">
+    <w:p>
+      <w:pPr>
+        <w:spacing w:after="0" w:line="240" w:lineRule="auto"/>
+      </w:pPr>
+      <w:r>
+        <w:separator/>
+      </w:r>
+    </w:p>
+  </w:footnote>
+  <w:footnote w:type="continuationSeparator" w:id="0">
+    <w:p>
+      <w:pPr>
+        <w:spacing w:after="0" w:line="240" w:lineRule="auto"/>
+      </w:pPr>
+      <w:r>
+        <w:continuationSeparator/>
+      </w:r>
+    </w:p>
+  </w:footnote>
+</w:footnotes>
 </file>
 
 <file path=word/numbering.xml><?xml version="1.0" encoding="utf-8"?>
@@ -6518,6 +7497,82 @@
       <w:bCs/>
     </w:rPr>
   </w:style>
+  <w:style w:type="paragraph" w:styleId="Buborkszveg">
+    <w:name w:val="Balloon Text"/>
+    <w:basedOn w:val="Norml"/>
+    <w:link w:val="BuborkszvegChar"/>
+    <w:uiPriority w:val="99"/>
+    <w:semiHidden/>
+    <w:unhideWhenUsed/>
+    <w:rsid w:val="00EF2D48"/>
+    <w:pPr>
+      <w:spacing w:after="0" w:line="240" w:lineRule="auto"/>
+    </w:pPr>
+    <w:rPr>
+      <w:rFonts w:ascii="Tahoma" w:hAnsi="Tahoma" w:cs="Tahoma"/>
+      <w:sz w:val="16"/>
+      <w:szCs w:val="16"/>
+    </w:rPr>
+  </w:style>
+  <w:style w:type="character" w:customStyle="1" w:styleId="BuborkszvegChar">
+    <w:name w:val="Buborékszöveg Char"/>
+    <w:basedOn w:val="Bekezdsalapbettpusa"/>
+    <w:link w:val="Buborkszveg"/>
+    <w:uiPriority w:val="99"/>
+    <w:semiHidden/>
+    <w:rsid w:val="00EF2D48"/>
+    <w:rPr>
+      <w:rFonts w:ascii="Tahoma" w:hAnsi="Tahoma" w:cs="Tahoma"/>
+      <w:sz w:val="16"/>
+      <w:szCs w:val="16"/>
+    </w:rPr>
+  </w:style>
+  <w:style w:type="paragraph" w:styleId="lfej">
+    <w:name w:val="header"/>
+    <w:basedOn w:val="Norml"/>
+    <w:link w:val="lfejChar"/>
+    <w:uiPriority w:val="99"/>
+    <w:semiHidden/>
+    <w:unhideWhenUsed/>
+    <w:rsid w:val="00153E3C"/>
+    <w:pPr>
+      <w:tabs>
+        <w:tab w:val="center" w:pos="4536"/>
+        <w:tab w:val="right" w:pos="9072"/>
+      </w:tabs>
+      <w:spacing w:after="0" w:line="240" w:lineRule="auto"/>
+    </w:pPr>
+  </w:style>
+  <w:style w:type="character" w:customStyle="1" w:styleId="lfejChar">
+    <w:name w:val="Élőfej Char"/>
+    <w:basedOn w:val="Bekezdsalapbettpusa"/>
+    <w:link w:val="lfej"/>
+    <w:uiPriority w:val="99"/>
+    <w:semiHidden/>
+    <w:rsid w:val="00153E3C"/>
+  </w:style>
+  <w:style w:type="paragraph" w:styleId="llb">
+    <w:name w:val="footer"/>
+    <w:basedOn w:val="Norml"/>
+    <w:link w:val="llbChar"/>
+    <w:uiPriority w:val="99"/>
+    <w:unhideWhenUsed/>
+    <w:rsid w:val="00153E3C"/>
+    <w:pPr>
+      <w:tabs>
+        <w:tab w:val="center" w:pos="4536"/>
+        <w:tab w:val="right" w:pos="9072"/>
+      </w:tabs>
+      <w:spacing w:after="0" w:line="240" w:lineRule="auto"/>
+    </w:pPr>
+  </w:style>
+  <w:style w:type="character" w:customStyle="1" w:styleId="llbChar">
+    <w:name w:val="Élőláb Char"/>
+    <w:basedOn w:val="Bekezdsalapbettpusa"/>
+    <w:link w:val="llb"/>
+    <w:uiPriority w:val="99"/>
+    <w:rsid w:val="00153E3C"/>
+  </w:style>
 </w:styles>
 </file>
 

</xml_diff>